<commit_message>
added few points in resume
</commit_message>
<xml_diff>
--- a/Resume/Manoj_Kumar_Padigineti_Resume.docx
+++ b/Resume/Manoj_Kumar_Padigineti_Resume.docx
@@ -66,7 +66,7 @@
           <w:rFonts w:ascii="Cambria" w:hAnsi="Cambria"/>
         </w:rPr>
         <w:pict>
-          <v:rect id="_x0000_i1031" style="width:0;height:1.5pt" o:hralign="center" o:hrstd="t" o:hr="t" fillcolor="#a0a0a0" stroked="f"/>
+          <v:rect id="_x0000_i1025" style="width:0;height:1.5pt" o:hralign="center" o:hrstd="t" o:hr="t" fillcolor="#a0a0a0" stroked="f"/>
         </w:pict>
       </w:r>
     </w:p>
@@ -131,6 +131,231 @@
         <w:rPr>
           <w:rFonts w:ascii="Cambria" w:hAnsi="Cambria"/>
           <w:b/>
+          <w:sz w:val="28"/>
+          <w:szCs w:val="28"/>
+        </w:rPr>
+      </w:pPr>
+      <w:r>
+        <w:rPr>
+          <w:rFonts w:ascii="Cambria" w:hAnsi="Cambria"/>
+        </w:rPr>
+        <w:t xml:space="preserve">                                                             </w:t>
+      </w:r>
+      <w:r>
+        <w:rPr>
+          <w:rFonts w:ascii="Cambria" w:hAnsi="Cambria"/>
+        </w:rPr>
+        <w:t xml:space="preserve"> </w:t>
+      </w:r>
+      <w:r>
+        <w:rPr>
+          <w:rFonts w:ascii="Cambria" w:hAnsi="Cambria"/>
+        </w:rPr>
+        <w:t xml:space="preserve">  </w:t>
+      </w:r>
+      <w:r>
+        <w:rPr>
+          <w:rFonts w:ascii="Cambria" w:hAnsi="Cambria"/>
+          <w:b/>
+          <w:color w:val="2E74B5" w:themeColor="accent5" w:themeShade="BF"/>
+          <w:sz w:val="28"/>
+          <w:szCs w:val="28"/>
+        </w:rPr>
+        <w:t>D</w:t>
+      </w:r>
+      <w:r>
+        <w:rPr>
+          <w:rFonts w:ascii="Cambria" w:hAnsi="Cambria"/>
+          <w:b/>
+          <w:color w:val="2E74B5" w:themeColor="accent5" w:themeShade="BF"/>
+          <w:sz w:val="28"/>
+          <w:szCs w:val="28"/>
+        </w:rPr>
+        <w:t>ev</w:t>
+      </w:r>
+      <w:r>
+        <w:rPr>
+          <w:rFonts w:ascii="Cambria" w:hAnsi="Cambria"/>
+          <w:b/>
+          <w:color w:val="2E74B5" w:themeColor="accent5" w:themeShade="BF"/>
+          <w:sz w:val="28"/>
+          <w:szCs w:val="28"/>
+        </w:rPr>
+        <w:t>O</w:t>
+      </w:r>
+      <w:r>
+        <w:rPr>
+          <w:rFonts w:ascii="Cambria" w:hAnsi="Cambria"/>
+          <w:b/>
+          <w:color w:val="2E74B5" w:themeColor="accent5" w:themeShade="BF"/>
+          <w:sz w:val="28"/>
+          <w:szCs w:val="28"/>
+        </w:rPr>
+        <w:t>ps</w:t>
+      </w:r>
+      <w:r>
+        <w:rPr>
+          <w:rFonts w:ascii="Cambria" w:hAnsi="Cambria"/>
+          <w:b/>
+          <w:color w:val="2E74B5" w:themeColor="accent5" w:themeShade="BF"/>
+          <w:sz w:val="28"/>
+          <w:szCs w:val="28"/>
+        </w:rPr>
+        <w:t xml:space="preserve"> E</w:t>
+      </w:r>
+      <w:r>
+        <w:rPr>
+          <w:rFonts w:ascii="Cambria" w:hAnsi="Cambria"/>
+          <w:b/>
+          <w:color w:val="2E74B5" w:themeColor="accent5" w:themeShade="BF"/>
+          <w:sz w:val="28"/>
+          <w:szCs w:val="28"/>
+        </w:rPr>
+        <w:t>ngineer</w:t>
+      </w:r>
+    </w:p>
+    <w:p>
+      <w:pPr>
+        <w:spacing w:after="0"/>
+        <w:rPr>
+          <w:rFonts w:ascii="Cambria" w:hAnsi="Cambria"/>
+        </w:rPr>
+      </w:pPr>
+      <w:r>
+        <w:rPr>
+          <w:rFonts w:ascii="Cambria" w:hAnsi="Cambria"/>
+        </w:rPr>
+        <w:pict>
+          <v:rect id="_x0000_i1026" style="width:0;height:1.5pt" o:hralign="center" o:hrstd="t" o:hr="t" fillcolor="#a0a0a0" stroked="f"/>
+        </w:pict>
+      </w:r>
+    </w:p>
+    <w:p>
+      <w:pPr>
+        <w:spacing w:after="180"/>
+        <w:jc w:val="center"/>
+        <w:rPr>
+          <w:rFonts w:ascii="Cambria" w:hAnsi="Cambria"/>
+          <w:b/>
+        </w:rPr>
+      </w:pPr>
+      <w:r>
+        <w:rPr>
+          <w:rFonts w:ascii="Cambria" w:hAnsi="Cambria"/>
+          <w:b/>
+        </w:rPr>
+        <w:t xml:space="preserve">DEVSECOPS | CLOUD | CONTAINERIZATION | ORCHESTRATION | CI/CD | IaC </w:t>
+      </w:r>
+      <w:r>
+        <w:rPr>
+          <w:rFonts w:ascii="Cambria" w:hAnsi="Cambria"/>
+          <w:b/>
+        </w:rPr>
+        <w:t xml:space="preserve">                               </w:t>
+      </w:r>
+      <w:r>
+        <w:rPr>
+          <w:rFonts w:ascii="Cambria" w:hAnsi="Cambria"/>
+          <w:b/>
+        </w:rPr>
+        <w:t>|</w:t>
+      </w:r>
+      <w:r>
+        <w:rPr>
+          <w:rFonts w:ascii="Cambria" w:hAnsi="Cambria"/>
+          <w:b/>
+        </w:rPr>
+        <w:t xml:space="preserve"> </w:t>
+      </w:r>
+      <w:r>
+        <w:rPr>
+          <w:rFonts w:ascii="Cambria" w:hAnsi="Cambria"/>
+          <w:b/>
+        </w:rPr>
+        <w:t>OBSERVABILITY | SECURITY | AUTOMATION</w:t>
+      </w:r>
+      <w:r>
+        <w:rPr>
+          <w:rFonts w:ascii="Cambria" w:hAnsi="Cambria"/>
+          <w:b/>
+        </w:rPr>
+        <w:t xml:space="preserve"> </w:t>
+      </w:r>
+      <w:r>
+        <w:rPr>
+          <w:rFonts w:ascii="Cambria" w:hAnsi="Cambria"/>
+          <w:b/>
+        </w:rPr>
+        <w:t>|</w:t>
+      </w:r>
+    </w:p>
+    <w:p>
+      <w:pPr>
+        <w:spacing w:after="300"/>
+        <w:jc w:val="both"/>
+        <w:rPr>
+          <w:rFonts w:ascii="Cambria" w:hAnsi="Cambria"/>
+          <w:sz w:val="21"/>
+          <w:szCs w:val="21"/>
+        </w:rPr>
+      </w:pPr>
+      <w:r>
+        <w:rPr>
+          <w:rFonts w:ascii="Cambria" w:hAnsi="Cambria"/>
+          <w:sz w:val="21"/>
+          <w:szCs w:val="21"/>
+        </w:rPr>
+        <w:t xml:space="preserve">DevOps Engineer with 4+ years of experience in cloud-native microservices on AWS, specializing in CI/CD (Jenkins, GitHub Actions), </w:t>
+      </w:r>
+      <w:r>
+        <w:rPr>
+          <w:rFonts w:ascii="Cambria" w:hAnsi="Cambria"/>
+          <w:sz w:val="21"/>
+          <w:szCs w:val="21"/>
+        </w:rPr>
+        <w:t>containerization (</w:t>
+      </w:r>
+      <w:r>
+        <w:rPr>
+          <w:rFonts w:ascii="Cambria" w:hAnsi="Cambria"/>
+          <w:sz w:val="21"/>
+          <w:szCs w:val="21"/>
+        </w:rPr>
+        <w:t>Kubernetes, Docker</w:t>
+      </w:r>
+      <w:r>
+        <w:rPr>
+          <w:rFonts w:ascii="Cambria" w:hAnsi="Cambria"/>
+          <w:sz w:val="21"/>
+          <w:szCs w:val="21"/>
+        </w:rPr>
+        <w:t>)</w:t>
+      </w:r>
+      <w:r>
+        <w:rPr>
+          <w:rFonts w:ascii="Cambria" w:hAnsi="Cambria"/>
+          <w:sz w:val="21"/>
+          <w:szCs w:val="21"/>
+        </w:rPr>
+        <w:t xml:space="preserve"> and IaC (Terraform, Ansible). Experienced in DevSecOps practices including vulnerability scann</w:t>
+      </w:r>
+      <w:bookmarkStart w:id="0" w:name="_GoBack"/>
+      <w:bookmarkEnd w:id="0"/>
+      <w:r>
+        <w:rPr>
+          <w:rFonts w:ascii="Cambria" w:hAnsi="Cambria"/>
+          <w:sz w:val="21"/>
+          <w:szCs w:val="21"/>
+        </w:rPr>
+        <w:t>ing (SAST and container scanning using Trivy) and secrets management (HashiCorp Vault), with strong expertise in observability (Prometheus, Grafana, ELK, New Relic) to drive secure, scalable, and highly available systems.</w:t>
+      </w:r>
+    </w:p>
+    <w:p>
+      <w:pPr>
+        <w:spacing w:after="0"/>
+        <w:rPr>
+          <w:rFonts w:ascii="Cambria" w:hAnsi="Cambria"/>
+          <w:b/>
           <w:sz w:val="26"/>
           <w:szCs w:val="26"/>
         </w:rPr>
@@ -138,23 +363,15 @@
       <w:r>
         <w:rPr>
           <w:rFonts w:ascii="Cambria" w:hAnsi="Cambria"/>
-        </w:rPr>
-        <w:t xml:space="preserve">                                                                </w:t>
-      </w:r>
-      <w:r>
-        <w:rPr>
-          <w:rFonts w:ascii="Cambria" w:hAnsi="Cambria"/>
-          <w:b/>
-          <w:color w:val="2E74B5" w:themeColor="accent5" w:themeShade="BF"/>
+          <w:b/>
           <w:sz w:val="26"/>
           <w:szCs w:val="26"/>
         </w:rPr>
-        <w:t>DEVOPS ENGINEER</w:t>
-      </w:r>
-    </w:p>
-    <w:p>
-      <w:pPr>
-        <w:spacing w:after="0"/>
+        <w:t>PROFESSIONAL SKILLS</w:t>
+      </w:r>
+    </w:p>
+    <w:p>
+      <w:pPr>
         <w:rPr>
           <w:rFonts w:ascii="Cambria" w:hAnsi="Cambria"/>
         </w:rPr>
@@ -164,124 +381,7 @@
           <w:rFonts w:ascii="Cambria" w:hAnsi="Cambria"/>
         </w:rPr>
         <w:pict>
-          <v:rect id="_x0000_i1033" style="width:0;height:1.5pt" o:hralign="center" o:hrstd="t" o:hr="t" fillcolor="#a0a0a0" stroked="f"/>
-        </w:pict>
-      </w:r>
-    </w:p>
-    <w:p>
-      <w:pPr>
-        <w:spacing w:after="180"/>
-        <w:jc w:val="center"/>
-        <w:rPr>
-          <w:rFonts w:ascii="Cambria" w:hAnsi="Cambria"/>
-          <w:b/>
-        </w:rPr>
-      </w:pPr>
-      <w:r>
-        <w:rPr>
-          <w:rFonts w:ascii="Cambria" w:hAnsi="Cambria"/>
-          <w:b/>
-        </w:rPr>
-        <w:t xml:space="preserve">DEVSECOPS | CLOUD | CONTAINERIZATION | ORCHESTRATION | CI/CD | IaC </w:t>
-      </w:r>
-      <w:r>
-        <w:rPr>
-          <w:rFonts w:ascii="Cambria" w:hAnsi="Cambria"/>
-          <w:b/>
-        </w:rPr>
-        <w:t xml:space="preserve">                               </w:t>
-      </w:r>
-      <w:r>
-        <w:rPr>
-          <w:rFonts w:ascii="Cambria" w:hAnsi="Cambria"/>
-          <w:b/>
-        </w:rPr>
-        <w:t>|</w:t>
-      </w:r>
-      <w:r>
-        <w:rPr>
-          <w:rFonts w:ascii="Cambria" w:hAnsi="Cambria"/>
-          <w:b/>
-        </w:rPr>
-        <w:t xml:space="preserve"> </w:t>
-      </w:r>
-      <w:r>
-        <w:rPr>
-          <w:rFonts w:ascii="Cambria" w:hAnsi="Cambria"/>
-          <w:b/>
-        </w:rPr>
-        <w:t>OBSERVABILITY | SECURITY | AUTOMATION</w:t>
-      </w:r>
-      <w:r>
-        <w:rPr>
-          <w:rFonts w:ascii="Cambria" w:hAnsi="Cambria"/>
-          <w:b/>
-        </w:rPr>
-        <w:t xml:space="preserve"> </w:t>
-      </w:r>
-      <w:r>
-        <w:rPr>
-          <w:rFonts w:ascii="Cambria" w:hAnsi="Cambria"/>
-          <w:b/>
-        </w:rPr>
-        <w:t>|</w:t>
-      </w:r>
-    </w:p>
-    <w:p>
-      <w:pPr>
-        <w:spacing w:after="300"/>
-        <w:jc w:val="both"/>
-        <w:rPr>
-          <w:rFonts w:ascii="Cambria" w:hAnsi="Cambria"/>
-        </w:rPr>
-      </w:pPr>
-      <w:r>
-        <w:rPr>
-          <w:rFonts w:ascii="Cambria" w:hAnsi="Cambria"/>
-        </w:rPr>
-        <w:t>DevOps Engineer with 4+ years of experience in designing, securing, and automating cloud-native applications and infrastructure across AWS, Azure and GCP. Expertise in building secure CI/CD pipelines using Jenkins, GitHub Actions. Integrating security practices such vulnerability scanning, and secrets management using HashiCorp Vault. Strong hands-on experience with Kubernetes, Docker, Istio and Infrastructure as Code (Terraform, Ansible). Proficient in monitoring and observability using Prometheus, Grafana, ELK Stack, New Relic, Jaeger to enhance system reliability and incident response. Skilled in cloud security including IAM, network security, and policy enforcement, with experience supporting enterprise initiatives like Oracle database migrations to AWS RDS. Adept at embedding security across the SDLC, reducing risks, and enabling high-performance, secure deployment</w:t>
-      </w:r>
-      <w:bookmarkStart w:id="0" w:name="_GoBack"/>
-      <w:bookmarkEnd w:id="0"/>
-      <w:r>
-        <w:rPr>
-          <w:rFonts w:ascii="Cambria" w:hAnsi="Cambria"/>
-        </w:rPr>
-        <w:t>s in production environments</w:t>
-      </w:r>
-    </w:p>
-    <w:p>
-      <w:pPr>
-        <w:spacing w:after="0"/>
-        <w:rPr>
-          <w:rFonts w:ascii="Cambria" w:hAnsi="Cambria"/>
-          <w:b/>
-          <w:sz w:val="26"/>
-          <w:szCs w:val="26"/>
-        </w:rPr>
-      </w:pPr>
-      <w:r>
-        <w:rPr>
-          <w:rFonts w:ascii="Cambria" w:hAnsi="Cambria"/>
-          <w:b/>
-          <w:sz w:val="26"/>
-          <w:szCs w:val="26"/>
-        </w:rPr>
-        <w:t>PROFESSIONAL SKILLS</w:t>
-      </w:r>
-    </w:p>
-    <w:p>
-      <w:pPr>
-        <w:rPr>
-          <w:rFonts w:ascii="Cambria" w:hAnsi="Cambria"/>
-        </w:rPr>
-      </w:pPr>
-      <w:r>
-        <w:rPr>
-          <w:rFonts w:ascii="Cambria" w:hAnsi="Cambria"/>
-        </w:rPr>
-        <w:pict>
-          <v:rect id="_x0000_i1034" style="width:0;height:1.5pt" o:hralign="center" o:hrstd="t" o:hr="t" fillcolor="#a0a0a0" stroked="f"/>
+          <v:rect id="_x0000_i1027" style="width:0;height:1.5pt" o:hralign="center" o:hrstd="t" o:hr="t" fillcolor="#a0a0a0" stroked="f"/>
         </w:pict>
       </w:r>
     </w:p>
@@ -296,20 +396,26 @@
         <w:rPr>
           <w:rFonts w:ascii="Cambria" w:hAnsi="Cambria"/>
           <w:b/>
-        </w:rPr>
-      </w:pPr>
-      <w:r>
-        <w:rPr>
-          <w:rFonts w:ascii="Cambria" w:hAnsi="Cambria"/>
-          <w:b/>
-        </w:rPr>
-        <w:t xml:space="preserve">DevOps &amp; DevSecOps Tools: </w:t>
-      </w:r>
-      <w:r>
-        <w:rPr>
-          <w:rFonts w:ascii="Cambria" w:hAnsi="Cambria"/>
-        </w:rPr>
-        <w:t>Jenkins, Maven, Nexus, JFrog, SonarQube, Trivy, Checkmarx (SAST, SCA), ArgoCD, Helm, Istio.</w:t>
+          <w:sz w:val="21"/>
+          <w:szCs w:val="21"/>
+        </w:rPr>
+      </w:pPr>
+      <w:r>
+        <w:rPr>
+          <w:rFonts w:ascii="Cambria" w:hAnsi="Cambria"/>
+          <w:b/>
+          <w:sz w:val="21"/>
+          <w:szCs w:val="21"/>
+        </w:rPr>
+        <w:t>DevOps &amp; DevSecOps Tools:</w:t>
+      </w:r>
+      <w:r>
+        <w:rPr>
+          <w:rFonts w:ascii="Cambria" w:hAnsi="Cambria"/>
+          <w:sz w:val="21"/>
+          <w:szCs w:val="21"/>
+        </w:rPr>
+        <w:t xml:space="preserve"> SonarQube, Trivy, Checkmarx (SAST, SCA)</w:t>
       </w:r>
     </w:p>
     <w:p>
@@ -323,20 +429,34 @@
         <w:rPr>
           <w:rFonts w:ascii="Cambria" w:hAnsi="Cambria"/>
           <w:b/>
-        </w:rPr>
-      </w:pPr>
-      <w:r>
-        <w:rPr>
-          <w:rFonts w:ascii="Cambria" w:hAnsi="Cambria"/>
-          <w:b/>
+          <w:sz w:val="21"/>
+          <w:szCs w:val="21"/>
+        </w:rPr>
+      </w:pPr>
+      <w:r>
+        <w:rPr>
+          <w:rFonts w:ascii="Cambria" w:hAnsi="Cambria"/>
+          <w:b/>
+          <w:sz w:val="21"/>
+          <w:szCs w:val="21"/>
         </w:rPr>
         <w:t xml:space="preserve">CI/CD: </w:t>
       </w:r>
       <w:r>
         <w:rPr>
           <w:rFonts w:ascii="Cambria" w:hAnsi="Cambria"/>
+          <w:sz w:val="21"/>
+          <w:szCs w:val="21"/>
         </w:rPr>
         <w:t>Jenkins, GitHub Actions, Azure DevOps</w:t>
+      </w:r>
+      <w:r>
+        <w:rPr>
+          <w:rFonts w:ascii="Cambria" w:hAnsi="Cambria"/>
+          <w:sz w:val="21"/>
+          <w:szCs w:val="21"/>
+        </w:rPr>
+        <w:t>, ArgoCD</w:t>
       </w:r>
     </w:p>
     <w:p>
@@ -350,20 +470,34 @@
         <w:rPr>
           <w:rFonts w:ascii="Cambria" w:hAnsi="Cambria"/>
           <w:b/>
-        </w:rPr>
-      </w:pPr>
-      <w:r>
-        <w:rPr>
-          <w:rFonts w:ascii="Cambria" w:hAnsi="Cambria"/>
-          <w:b/>
+          <w:sz w:val="21"/>
+          <w:szCs w:val="21"/>
+        </w:rPr>
+      </w:pPr>
+      <w:r>
+        <w:rPr>
+          <w:rFonts w:ascii="Cambria" w:hAnsi="Cambria"/>
+          <w:b/>
+          <w:sz w:val="21"/>
+          <w:szCs w:val="21"/>
         </w:rPr>
         <w:t xml:space="preserve">Cloud Platforms &amp; Services: </w:t>
       </w:r>
       <w:r>
         <w:rPr>
           <w:rFonts w:ascii="Cambria" w:hAnsi="Cambria"/>
-        </w:rPr>
-        <w:t>AWS (EC2, EKS, ECR, RDS, IAM, Route53, KMS, ACM), Azure, GCP</w:t>
+          <w:sz w:val="21"/>
+          <w:szCs w:val="21"/>
+        </w:rPr>
+        <w:t>AWS</w:t>
+      </w:r>
+      <w:r>
+        <w:rPr>
+          <w:rFonts w:ascii="Cambria" w:hAnsi="Cambria"/>
+          <w:sz w:val="21"/>
+          <w:szCs w:val="21"/>
+        </w:rPr>
+        <w:t xml:space="preserve"> (GOV/Public)</w:t>
       </w:r>
     </w:p>
     <w:p>
@@ -377,20 +511,26 @@
         <w:rPr>
           <w:rFonts w:ascii="Cambria" w:hAnsi="Cambria"/>
           <w:b/>
-        </w:rPr>
-      </w:pPr>
-      <w:r>
-        <w:rPr>
-          <w:rFonts w:ascii="Cambria" w:hAnsi="Cambria"/>
-          <w:b/>
-        </w:rPr>
-        <w:t xml:space="preserve">Containers &amp; Orchestration: </w:t>
-      </w:r>
-      <w:r>
-        <w:rPr>
-          <w:rFonts w:ascii="Cambria" w:hAnsi="Cambria"/>
-        </w:rPr>
-        <w:t>Docker, Kubernetes</w:t>
+          <w:sz w:val="21"/>
+          <w:szCs w:val="21"/>
+        </w:rPr>
+      </w:pPr>
+      <w:r>
+        <w:rPr>
+          <w:rFonts w:ascii="Cambria" w:hAnsi="Cambria"/>
+          <w:b/>
+          <w:sz w:val="21"/>
+          <w:szCs w:val="21"/>
+        </w:rPr>
+        <w:t xml:space="preserve">Service Mesh: </w:t>
+      </w:r>
+      <w:r>
+        <w:rPr>
+          <w:rFonts w:ascii="Cambria" w:hAnsi="Cambria"/>
+          <w:sz w:val="21"/>
+          <w:szCs w:val="21"/>
+        </w:rPr>
+        <w:t>Istio</w:t>
       </w:r>
     </w:p>
     <w:p>
@@ -404,34 +544,26 @@
         <w:rPr>
           <w:rFonts w:ascii="Cambria" w:hAnsi="Cambria"/>
           <w:b/>
-        </w:rPr>
-      </w:pPr>
-      <w:r>
-        <w:rPr>
-          <w:rFonts w:ascii="Cambria" w:hAnsi="Cambria"/>
-          <w:b/>
-        </w:rPr>
-        <w:t>Infrastructure as Code</w:t>
-      </w:r>
-      <w:r>
-        <w:rPr>
-          <w:rFonts w:ascii="Cambria" w:hAnsi="Cambria"/>
-          <w:b/>
-        </w:rPr>
-        <w:t xml:space="preserve"> </w:t>
-      </w:r>
-      <w:r>
-        <w:rPr>
-          <w:rFonts w:ascii="Cambria" w:hAnsi="Cambria"/>
-          <w:b/>
-        </w:rPr>
-        <w:t xml:space="preserve">(IaC) &amp; Configuration Management: </w:t>
-      </w:r>
-      <w:r>
-        <w:rPr>
-          <w:rFonts w:ascii="Cambria" w:hAnsi="Cambria"/>
-        </w:rPr>
-        <w:t>Terraform, Ansible</w:t>
+          <w:sz w:val="21"/>
+          <w:szCs w:val="21"/>
+        </w:rPr>
+      </w:pPr>
+      <w:r>
+        <w:rPr>
+          <w:rFonts w:ascii="Cambria" w:hAnsi="Cambria"/>
+          <w:b/>
+          <w:sz w:val="21"/>
+          <w:szCs w:val="21"/>
+        </w:rPr>
+        <w:t xml:space="preserve">Build &amp; Artifact Management: </w:t>
+      </w:r>
+      <w:r>
+        <w:rPr>
+          <w:rFonts w:ascii="Cambria" w:hAnsi="Cambria"/>
+          <w:sz w:val="21"/>
+          <w:szCs w:val="21"/>
+        </w:rPr>
+        <w:t>Maven, Nexus Repository Manager, JFrog Artifactory</w:t>
       </w:r>
     </w:p>
     <w:p>
@@ -445,20 +577,34 @@
         <w:rPr>
           <w:rFonts w:ascii="Cambria" w:hAnsi="Cambria"/>
           <w:b/>
-        </w:rPr>
-      </w:pPr>
-      <w:r>
-        <w:rPr>
-          <w:rFonts w:ascii="Cambria" w:hAnsi="Cambria"/>
-          <w:b/>
-        </w:rPr>
-        <w:t xml:space="preserve">Monitoring &amp; Observability: </w:t>
-      </w:r>
-      <w:r>
-        <w:rPr>
-          <w:rFonts w:ascii="Cambria" w:hAnsi="Cambria"/>
-        </w:rPr>
-        <w:t>Prometheus, Grafana, ELK Stack, EFK Stack, Jaeger, New Relic</w:t>
+          <w:sz w:val="21"/>
+          <w:szCs w:val="21"/>
+        </w:rPr>
+      </w:pPr>
+      <w:r>
+        <w:rPr>
+          <w:rFonts w:ascii="Cambria" w:hAnsi="Cambria"/>
+          <w:b/>
+          <w:sz w:val="21"/>
+          <w:szCs w:val="21"/>
+        </w:rPr>
+        <w:t xml:space="preserve">Containers &amp; Orchestration: </w:t>
+      </w:r>
+      <w:r>
+        <w:rPr>
+          <w:rFonts w:ascii="Cambria" w:hAnsi="Cambria"/>
+          <w:sz w:val="21"/>
+          <w:szCs w:val="21"/>
+        </w:rPr>
+        <w:t>Docker, Kubernetes</w:t>
+      </w:r>
+      <w:r>
+        <w:rPr>
+          <w:rFonts w:ascii="Cambria" w:hAnsi="Cambria"/>
+          <w:sz w:val="21"/>
+          <w:szCs w:val="21"/>
+        </w:rPr>
+        <w:t>, Helm</w:t>
       </w:r>
     </w:p>
     <w:p>
@@ -472,20 +618,34 @@
         <w:rPr>
           <w:rFonts w:ascii="Cambria" w:hAnsi="Cambria"/>
           <w:b/>
-        </w:rPr>
-      </w:pPr>
-      <w:r>
-        <w:rPr>
-          <w:rFonts w:ascii="Cambria" w:hAnsi="Cambria"/>
-          <w:b/>
-        </w:rPr>
-        <w:t xml:space="preserve">Secrets Management: </w:t>
-      </w:r>
-      <w:r>
-        <w:rPr>
-          <w:rFonts w:ascii="Cambria" w:hAnsi="Cambria"/>
-        </w:rPr>
-        <w:t>HashiCorp Vault, AWS Secrets Manager, Azure Key Vault, Kubernetes Secrets</w:t>
+          <w:sz w:val="21"/>
+          <w:szCs w:val="21"/>
+        </w:rPr>
+      </w:pPr>
+      <w:r>
+        <w:rPr>
+          <w:rFonts w:ascii="Cambria" w:hAnsi="Cambria"/>
+          <w:b/>
+          <w:sz w:val="21"/>
+          <w:szCs w:val="21"/>
+        </w:rPr>
+        <w:t xml:space="preserve">Infrastructure as Code (IaC) &amp; Configuration Management: </w:t>
+      </w:r>
+      <w:r>
+        <w:rPr>
+          <w:rFonts w:ascii="Cambria" w:hAnsi="Cambria"/>
+          <w:sz w:val="21"/>
+          <w:szCs w:val="21"/>
+        </w:rPr>
+        <w:t>Terraform, Ansible</w:t>
+      </w:r>
+      <w:r>
+        <w:rPr>
+          <w:rFonts w:ascii="Cambria" w:hAnsi="Cambria"/>
+          <w:sz w:val="21"/>
+          <w:szCs w:val="21"/>
+        </w:rPr>
+        <w:t>, CFT</w:t>
       </w:r>
     </w:p>
     <w:p>
@@ -499,20 +659,34 @@
         <w:rPr>
           <w:rFonts w:ascii="Cambria" w:hAnsi="Cambria"/>
           <w:b/>
-        </w:rPr>
-      </w:pPr>
-      <w:r>
-        <w:rPr>
-          <w:rFonts w:ascii="Cambria" w:hAnsi="Cambria"/>
-          <w:b/>
-        </w:rPr>
-        <w:t xml:space="preserve">Version Control Systems: </w:t>
-      </w:r>
-      <w:r>
-        <w:rPr>
-          <w:rFonts w:ascii="Cambria" w:hAnsi="Cambria"/>
-        </w:rPr>
-        <w:t>Git, GitHub, Azure Repos</w:t>
+          <w:sz w:val="21"/>
+          <w:szCs w:val="21"/>
+        </w:rPr>
+      </w:pPr>
+      <w:r>
+        <w:rPr>
+          <w:rFonts w:ascii="Cambria" w:hAnsi="Cambria"/>
+          <w:b/>
+          <w:sz w:val="21"/>
+          <w:szCs w:val="21"/>
+        </w:rPr>
+        <w:t xml:space="preserve">Monitoring &amp; Observability: </w:t>
+      </w:r>
+      <w:r>
+        <w:rPr>
+          <w:rFonts w:ascii="Cambria" w:hAnsi="Cambria"/>
+          <w:sz w:val="21"/>
+          <w:szCs w:val="21"/>
+        </w:rPr>
+        <w:t>Prometheus, Grafana, ELK Stack, EFK Stack, Jaeger, New Relic</w:t>
+      </w:r>
+      <w:r>
+        <w:rPr>
+          <w:rFonts w:ascii="Cambria" w:hAnsi="Cambria"/>
+          <w:sz w:val="21"/>
+          <w:szCs w:val="21"/>
+        </w:rPr>
+        <w:t>, CloudWatch, OEM, Redgate</w:t>
       </w:r>
     </w:p>
     <w:p>
@@ -526,20 +700,26 @@
         <w:rPr>
           <w:rFonts w:ascii="Cambria" w:hAnsi="Cambria"/>
           <w:b/>
-        </w:rPr>
-      </w:pPr>
-      <w:r>
-        <w:rPr>
-          <w:rFonts w:ascii="Cambria" w:hAnsi="Cambria"/>
-          <w:b/>
-        </w:rPr>
-        <w:t xml:space="preserve">Programming &amp; Scripting: </w:t>
-      </w:r>
-      <w:r>
-        <w:rPr>
-          <w:rFonts w:ascii="Cambria" w:hAnsi="Cambria"/>
-        </w:rPr>
-        <w:t>Python, Shell Scripting</w:t>
+          <w:sz w:val="21"/>
+          <w:szCs w:val="21"/>
+        </w:rPr>
+      </w:pPr>
+      <w:r>
+        <w:rPr>
+          <w:rFonts w:ascii="Cambria" w:hAnsi="Cambria"/>
+          <w:b/>
+          <w:sz w:val="21"/>
+          <w:szCs w:val="21"/>
+        </w:rPr>
+        <w:t xml:space="preserve">Secrets Management: </w:t>
+      </w:r>
+      <w:r>
+        <w:rPr>
+          <w:rFonts w:ascii="Cambria" w:hAnsi="Cambria"/>
+          <w:sz w:val="21"/>
+          <w:szCs w:val="21"/>
+        </w:rPr>
+        <w:t>HashiCorp Vault, AWS Secrets Manager, Azure Key Vault, Kubernetes Secrets</w:t>
       </w:r>
     </w:p>
     <w:p>
@@ -553,27 +733,26 @@
         <w:rPr>
           <w:rFonts w:ascii="Cambria" w:hAnsi="Cambria"/>
           <w:b/>
-        </w:rPr>
-      </w:pPr>
-      <w:r>
-        <w:rPr>
-          <w:rFonts w:ascii="Cambria" w:hAnsi="Cambria"/>
-          <w:b/>
-        </w:rPr>
-        <w:t>ITSM</w:t>
-      </w:r>
-      <w:r>
-        <w:rPr>
-          <w:rFonts w:ascii="Cambria" w:hAnsi="Cambria"/>
-          <w:b/>
-        </w:rPr>
-        <w:t>:</w:t>
-      </w:r>
-      <w:r>
-        <w:rPr>
-          <w:rFonts w:ascii="Cambria" w:hAnsi="Cambria"/>
-        </w:rPr>
-        <w:t xml:space="preserve"> ServiceNow, Jira</w:t>
+          <w:sz w:val="21"/>
+          <w:szCs w:val="21"/>
+        </w:rPr>
+      </w:pPr>
+      <w:r>
+        <w:rPr>
+          <w:rFonts w:ascii="Cambria" w:hAnsi="Cambria"/>
+          <w:b/>
+          <w:sz w:val="21"/>
+          <w:szCs w:val="21"/>
+        </w:rPr>
+        <w:t xml:space="preserve">Databases: </w:t>
+      </w:r>
+      <w:r>
+        <w:rPr>
+          <w:rFonts w:ascii="Cambria" w:hAnsi="Cambria"/>
+          <w:sz w:val="21"/>
+          <w:szCs w:val="21"/>
+        </w:rPr>
+        <w:t>Oracle</w:t>
       </w:r>
     </w:p>
     <w:p>
@@ -587,20 +766,26 @@
         <w:rPr>
           <w:rFonts w:ascii="Cambria" w:hAnsi="Cambria"/>
           <w:b/>
-        </w:rPr>
-      </w:pPr>
-      <w:r>
-        <w:rPr>
-          <w:rFonts w:ascii="Cambria" w:hAnsi="Cambria"/>
-          <w:b/>
-        </w:rPr>
-        <w:t xml:space="preserve">Methodologies: </w:t>
-      </w:r>
-      <w:r>
-        <w:rPr>
-          <w:rFonts w:ascii="Cambria" w:hAnsi="Cambria"/>
-        </w:rPr>
-        <w:t>Agile (Scrum)</w:t>
+          <w:sz w:val="21"/>
+          <w:szCs w:val="21"/>
+        </w:rPr>
+      </w:pPr>
+      <w:r>
+        <w:rPr>
+          <w:rFonts w:ascii="Cambria" w:hAnsi="Cambria"/>
+          <w:b/>
+          <w:sz w:val="21"/>
+          <w:szCs w:val="21"/>
+        </w:rPr>
+        <w:t xml:space="preserve">Version Control Systems: </w:t>
+      </w:r>
+      <w:r>
+        <w:rPr>
+          <w:rFonts w:ascii="Cambria" w:hAnsi="Cambria"/>
+          <w:sz w:val="21"/>
+          <w:szCs w:val="21"/>
+        </w:rPr>
+        <w:t>Git, GitHub, Azure Repos</w:t>
       </w:r>
     </w:p>
     <w:p>
@@ -614,85 +799,158 @@
         <w:rPr>
           <w:rFonts w:ascii="Cambria" w:hAnsi="Cambria"/>
           <w:b/>
-        </w:rPr>
-      </w:pPr>
-      <w:r>
-        <w:rPr>
-          <w:rFonts w:ascii="Cambria" w:hAnsi="Cambria"/>
-          <w:b/>
+          <w:sz w:val="21"/>
+          <w:szCs w:val="21"/>
+        </w:rPr>
+      </w:pPr>
+      <w:r>
+        <w:rPr>
+          <w:rFonts w:ascii="Cambria" w:hAnsi="Cambria"/>
+          <w:b/>
+          <w:sz w:val="21"/>
+          <w:szCs w:val="21"/>
+        </w:rPr>
+        <w:t xml:space="preserve">Programming &amp; Scripting: </w:t>
+      </w:r>
+      <w:r>
+        <w:rPr>
+          <w:rFonts w:ascii="Cambria" w:hAnsi="Cambria"/>
+          <w:sz w:val="21"/>
+          <w:szCs w:val="21"/>
+        </w:rPr>
+        <w:t>Python, Shell Scripting</w:t>
+      </w:r>
+    </w:p>
+    <w:p>
+      <w:pPr>
+        <w:pStyle w:val="ListParagraph"/>
+        <w:numPr>
+          <w:ilvl w:val="0"/>
+          <w:numId w:val="1"/>
+        </w:numPr>
+        <w:ind w:left="360"/>
+        <w:rPr>
+          <w:rFonts w:ascii="Cambria" w:hAnsi="Cambria"/>
+          <w:b/>
+          <w:sz w:val="21"/>
+          <w:szCs w:val="21"/>
+        </w:rPr>
+      </w:pPr>
+      <w:r>
+        <w:rPr>
+          <w:rFonts w:ascii="Cambria" w:hAnsi="Cambria"/>
+          <w:b/>
+          <w:sz w:val="21"/>
+          <w:szCs w:val="21"/>
+        </w:rPr>
+        <w:t>ITSM:</w:t>
+      </w:r>
+      <w:r>
+        <w:rPr>
+          <w:rFonts w:ascii="Cambria" w:hAnsi="Cambria"/>
+          <w:sz w:val="21"/>
+          <w:szCs w:val="21"/>
+        </w:rPr>
+        <w:t xml:space="preserve"> ServiceNow, Jira</w:t>
+      </w:r>
+    </w:p>
+    <w:p>
+      <w:pPr>
+        <w:pStyle w:val="ListParagraph"/>
+        <w:numPr>
+          <w:ilvl w:val="0"/>
+          <w:numId w:val="1"/>
+        </w:numPr>
+        <w:ind w:left="360"/>
+        <w:rPr>
+          <w:rFonts w:ascii="Cambria" w:hAnsi="Cambria"/>
+          <w:b/>
+          <w:sz w:val="21"/>
+          <w:szCs w:val="21"/>
+        </w:rPr>
+      </w:pPr>
+      <w:r>
+        <w:rPr>
+          <w:rFonts w:ascii="Cambria" w:hAnsi="Cambria"/>
+          <w:b/>
+          <w:sz w:val="21"/>
+          <w:szCs w:val="21"/>
+        </w:rPr>
+        <w:t xml:space="preserve">Methodologies: </w:t>
+      </w:r>
+      <w:r>
+        <w:rPr>
+          <w:rFonts w:ascii="Cambria" w:hAnsi="Cambria"/>
+          <w:sz w:val="21"/>
+          <w:szCs w:val="21"/>
+        </w:rPr>
+        <w:t>Agile (Scrum)</w:t>
+      </w:r>
+    </w:p>
+    <w:p>
+      <w:pPr>
+        <w:pStyle w:val="ListParagraph"/>
+        <w:numPr>
+          <w:ilvl w:val="0"/>
+          <w:numId w:val="1"/>
+        </w:numPr>
+        <w:ind w:left="360"/>
+        <w:rPr>
+          <w:rFonts w:ascii="Cambria" w:hAnsi="Cambria"/>
+          <w:b/>
+          <w:sz w:val="21"/>
+          <w:szCs w:val="21"/>
+        </w:rPr>
+      </w:pPr>
+      <w:r>
+        <w:rPr>
+          <w:rFonts w:ascii="Cambria" w:hAnsi="Cambria"/>
+          <w:b/>
+          <w:sz w:val="21"/>
+          <w:szCs w:val="21"/>
         </w:rPr>
         <w:t xml:space="preserve">Operating Systems: </w:t>
       </w:r>
       <w:r>
         <w:rPr>
           <w:rFonts w:ascii="Cambria" w:hAnsi="Cambria"/>
-        </w:rPr>
-        <w:t>Linux, Windows</w:t>
-      </w:r>
-    </w:p>
-    <w:p>
-      <w:pPr>
-        <w:rPr>
-          <w:rFonts w:ascii="Cambria" w:hAnsi="Cambria"/>
-          <w:b/>
-        </w:rPr>
-      </w:pPr>
-    </w:p>
-    <w:p>
-      <w:pPr>
-        <w:rPr>
-          <w:rFonts w:ascii="Cambria" w:hAnsi="Cambria"/>
-          <w:b/>
-        </w:rPr>
-      </w:pPr>
-    </w:p>
-    <w:p>
-      <w:pPr>
-        <w:rPr>
-          <w:rFonts w:ascii="Cambria" w:hAnsi="Cambria"/>
-          <w:b/>
-        </w:rPr>
-      </w:pPr>
-    </w:p>
-    <w:p>
-      <w:pPr>
-        <w:rPr>
-          <w:rFonts w:ascii="Cambria" w:hAnsi="Cambria"/>
-          <w:b/>
-        </w:rPr>
-      </w:pPr>
-    </w:p>
-    <w:p>
-      <w:pPr>
-        <w:rPr>
-          <w:rFonts w:ascii="Cambria" w:hAnsi="Cambria"/>
-          <w:b/>
-        </w:rPr>
-      </w:pPr>
-    </w:p>
-    <w:p>
-      <w:pPr>
-        <w:rPr>
-          <w:rFonts w:ascii="Cambria" w:hAnsi="Cambria"/>
-          <w:b/>
-        </w:rPr>
-      </w:pPr>
-    </w:p>
-    <w:p>
-      <w:pPr>
-        <w:rPr>
-          <w:rFonts w:ascii="Cambria" w:hAnsi="Cambria"/>
-          <w:b/>
-        </w:rPr>
-      </w:pPr>
-    </w:p>
-    <w:p>
-      <w:pPr>
-        <w:rPr>
-          <w:rFonts w:ascii="Cambria" w:hAnsi="Cambria"/>
-          <w:b/>
-        </w:rPr>
-      </w:pPr>
+          <w:sz w:val="21"/>
+          <w:szCs w:val="21"/>
+        </w:rPr>
+        <w:t>Linux</w:t>
+      </w:r>
+      <w:r>
+        <w:rPr>
+          <w:rFonts w:ascii="Cambria" w:hAnsi="Cambria"/>
+          <w:sz w:val="21"/>
+          <w:szCs w:val="21"/>
+        </w:rPr>
+        <w:t xml:space="preserve"> (RedHat,</w:t>
+      </w:r>
+      <w:r>
+        <w:rPr>
+          <w:rFonts w:ascii="Cambria" w:hAnsi="Cambria"/>
+          <w:sz w:val="21"/>
+          <w:szCs w:val="21"/>
+        </w:rPr>
+        <w:t xml:space="preserve"> CentOS,</w:t>
+      </w:r>
+      <w:r>
+        <w:rPr>
+          <w:rFonts w:ascii="Cambria" w:hAnsi="Cambria"/>
+          <w:sz w:val="21"/>
+          <w:szCs w:val="21"/>
+        </w:rPr>
+        <w:t xml:space="preserve"> Ubuntu, SunOS),</w:t>
+      </w:r>
+      <w:r>
+        <w:rPr>
+          <w:rFonts w:ascii="Cambria" w:hAnsi="Cambria"/>
+          <w:sz w:val="21"/>
+          <w:szCs w:val="21"/>
+        </w:rPr>
+        <w:t xml:space="preserve"> Windows</w:t>
+      </w:r>
     </w:p>
     <w:p>
       <w:pPr>
@@ -704,15 +962,17 @@
           <w:szCs w:val="26"/>
         </w:rPr>
       </w:pPr>
-      <w:r>
+    </w:p>
+    <w:p>
+      <w:pPr>
+        <w:spacing w:after="0"/>
         <w:rPr>
           <w:rFonts w:ascii="Cambria" w:hAnsi="Cambria"/>
           <w:b/>
           <w:sz w:val="26"/>
           <w:szCs w:val="26"/>
         </w:rPr>
-        <w:t xml:space="preserve">PROFESSIONAL </w:t>
-      </w:r>
+      </w:pPr>
       <w:r>
         <w:rPr>
           <w:rFonts w:ascii="Cambria" w:hAnsi="Cambria"/>
@@ -720,6 +980,15 @@
           <w:sz w:val="26"/>
           <w:szCs w:val="26"/>
         </w:rPr>
+        <w:t xml:space="preserve">PROFESSIONAL </w:t>
+      </w:r>
+      <w:r>
+        <w:rPr>
+          <w:rFonts w:ascii="Cambria" w:hAnsi="Cambria"/>
+          <w:b/>
+          <w:sz w:val="26"/>
+          <w:szCs w:val="26"/>
+        </w:rPr>
         <w:t>EXPERIENCE</w:t>
       </w:r>
     </w:p>
@@ -734,7 +1003,7 @@
           <w:rFonts w:ascii="Cambria" w:hAnsi="Cambria"/>
         </w:rPr>
         <w:pict>
-          <v:rect id="_x0000_i1041" style="width:0;height:1.5pt" o:hralign="center" o:hrstd="t" o:hr="t" fillcolor="#a0a0a0" stroked="f"/>
+          <v:rect id="_x0000_i1028" style="width:0;height:1.5pt" o:hralign="center" o:hrstd="t" o:hr="t" fillcolor="#a0a0a0" stroked="f"/>
         </w:pict>
       </w:r>
     </w:p>
@@ -744,14 +1013,36 @@
         <w:rPr>
           <w:rFonts w:ascii="Cambria" w:hAnsi="Cambria"/>
           <w:b/>
-        </w:rPr>
-      </w:pPr>
-      <w:r>
-        <w:rPr>
-          <w:rFonts w:ascii="Cambria" w:hAnsi="Cambria"/>
-          <w:b/>
-        </w:rPr>
-        <w:t>WISSEN INFOTECH                                                                                                    FEB 2022 – PRESENT</w:t>
+          <w:sz w:val="21"/>
+          <w:szCs w:val="21"/>
+        </w:rPr>
+      </w:pPr>
+      <w:r>
+        <w:rPr>
+          <w:rFonts w:ascii="Cambria" w:hAnsi="Cambria"/>
+          <w:b/>
+          <w:sz w:val="21"/>
+          <w:szCs w:val="21"/>
+        </w:rPr>
+        <w:t>WISSEN INFOTECH</w:t>
+      </w:r>
+      <w:r>
+        <w:rPr>
+          <w:rFonts w:ascii="Cambria" w:hAnsi="Cambria"/>
+          <w:b/>
+          <w:sz w:val="21"/>
+          <w:szCs w:val="21"/>
+        </w:rPr>
+        <w:t xml:space="preserve"> PVT LTD  </w:t>
+      </w:r>
+      <w:r>
+        <w:rPr>
+          <w:rFonts w:ascii="Cambria" w:hAnsi="Cambria"/>
+          <w:b/>
+          <w:sz w:val="21"/>
+          <w:szCs w:val="21"/>
+        </w:rPr>
+        <w:t xml:space="preserve">                                                                                 FEB 2022 – PRESENT</w:t>
       </w:r>
     </w:p>
     <w:p>
@@ -760,14 +1051,36 @@
         <w:rPr>
           <w:rFonts w:ascii="Cambria" w:hAnsi="Cambria"/>
           <w:b/>
-        </w:rPr>
-      </w:pPr>
-      <w:r>
-        <w:rPr>
-          <w:rFonts w:ascii="Cambria" w:hAnsi="Cambria"/>
-          <w:b/>
-        </w:rPr>
-        <w:t>CLIENT: GE AEROSPACE                                                                                              HYDERABAD, TS</w:t>
+          <w:sz w:val="21"/>
+          <w:szCs w:val="21"/>
+        </w:rPr>
+      </w:pPr>
+      <w:r>
+        <w:rPr>
+          <w:rFonts w:ascii="Cambria" w:hAnsi="Cambria"/>
+          <w:b/>
+          <w:sz w:val="21"/>
+          <w:szCs w:val="21"/>
+        </w:rPr>
+        <w:t xml:space="preserve">CLIENT: GE AEROSPACE                                                                                            </w:t>
+      </w:r>
+      <w:r>
+        <w:rPr>
+          <w:rFonts w:ascii="Cambria" w:hAnsi="Cambria"/>
+          <w:b/>
+          <w:sz w:val="21"/>
+          <w:szCs w:val="21"/>
+        </w:rPr>
+        <w:t xml:space="preserve"> </w:t>
+      </w:r>
+      <w:r>
+        <w:rPr>
+          <w:rFonts w:ascii="Cambria" w:hAnsi="Cambria"/>
+          <w:b/>
+          <w:sz w:val="21"/>
+          <w:szCs w:val="21"/>
+        </w:rPr>
+        <w:t xml:space="preserve">  HYDERABAD, TS</w:t>
       </w:r>
     </w:p>
     <w:p>
@@ -776,12 +1089,16 @@
         <w:rPr>
           <w:rFonts w:ascii="Cambria" w:hAnsi="Cambria"/>
           <w:b/>
-        </w:rPr>
-      </w:pPr>
-      <w:r>
-        <w:rPr>
-          <w:rFonts w:ascii="Cambria" w:hAnsi="Cambria"/>
-          <w:b/>
+          <w:sz w:val="21"/>
+          <w:szCs w:val="21"/>
+        </w:rPr>
+      </w:pPr>
+      <w:r>
+        <w:rPr>
+          <w:rFonts w:ascii="Cambria" w:hAnsi="Cambria"/>
+          <w:b/>
+          <w:sz w:val="21"/>
+          <w:szCs w:val="21"/>
         </w:rPr>
         <w:t>PROJECTS:</w:t>
       </w:r>
@@ -797,12 +1114,16 @@
         <w:rPr>
           <w:rFonts w:ascii="Cambria" w:hAnsi="Cambria"/>
           <w:b/>
-        </w:rPr>
-      </w:pPr>
-      <w:r>
-        <w:rPr>
-          <w:rFonts w:ascii="Cambria" w:hAnsi="Cambria"/>
-          <w:b/>
+          <w:sz w:val="21"/>
+          <w:szCs w:val="21"/>
+        </w:rPr>
+      </w:pPr>
+      <w:r>
+        <w:rPr>
+          <w:rFonts w:ascii="Cambria" w:hAnsi="Cambria"/>
+          <w:b/>
+          <w:sz w:val="21"/>
+          <w:szCs w:val="21"/>
         </w:rPr>
         <w:t>T</w:t>
       </w:r>
@@ -810,6 +1131,8 @@
         <w:rPr>
           <w:rFonts w:ascii="Cambria" w:hAnsi="Cambria"/>
           <w:b/>
+          <w:sz w:val="21"/>
+          <w:szCs w:val="21"/>
         </w:rPr>
         <w:t>itle</w:t>
       </w:r>
@@ -817,19 +1140,16 @@
         <w:rPr>
           <w:rFonts w:ascii="Cambria" w:hAnsi="Cambria"/>
           <w:b/>
-        </w:rPr>
-        <w:t xml:space="preserve">: </w:t>
-      </w:r>
-      <w:r>
-        <w:rPr>
-          <w:rFonts w:ascii="Cambria" w:hAnsi="Cambria"/>
-          <w:b/>
-        </w:rPr>
-        <w:t xml:space="preserve"> </w:t>
-      </w:r>
-      <w:r>
-        <w:rPr>
-          <w:rFonts w:ascii="Cambria" w:hAnsi="Cambria"/>
+          <w:sz w:val="21"/>
+          <w:szCs w:val="21"/>
+        </w:rPr>
+        <w:t xml:space="preserve">:  </w:t>
+      </w:r>
+      <w:r>
+        <w:rPr>
+          <w:rFonts w:ascii="Cambria" w:hAnsi="Cambria"/>
+          <w:sz w:val="21"/>
+          <w:szCs w:val="21"/>
         </w:rPr>
         <w:t>AEHM (Aircraft Engine Health Monitoring System)</w:t>
       </w:r>
@@ -842,12 +1162,16 @@
         <w:rPr>
           <w:rFonts w:ascii="Cambria" w:hAnsi="Cambria"/>
           <w:b/>
-        </w:rPr>
-      </w:pPr>
-      <w:r>
-        <w:rPr>
-          <w:rFonts w:ascii="Cambria" w:hAnsi="Cambria"/>
-          <w:b/>
+          <w:sz w:val="21"/>
+          <w:szCs w:val="21"/>
+        </w:rPr>
+      </w:pPr>
+      <w:r>
+        <w:rPr>
+          <w:rFonts w:ascii="Cambria" w:hAnsi="Cambria"/>
+          <w:b/>
+          <w:sz w:val="21"/>
+          <w:szCs w:val="21"/>
         </w:rPr>
         <w:t>D</w:t>
       </w:r>
@@ -855,6 +1179,8 @@
         <w:rPr>
           <w:rFonts w:ascii="Cambria" w:hAnsi="Cambria"/>
           <w:b/>
+          <w:sz w:val="21"/>
+          <w:szCs w:val="21"/>
         </w:rPr>
         <w:t>uration</w:t>
       </w:r>
@@ -862,6 +1188,8 @@
         <w:rPr>
           <w:rFonts w:ascii="Cambria" w:hAnsi="Cambria"/>
           <w:b/>
+          <w:sz w:val="21"/>
+          <w:szCs w:val="21"/>
         </w:rPr>
         <w:t>:</w:t>
       </w:r>
@@ -869,12 +1197,16 @@
         <w:rPr>
           <w:rFonts w:ascii="Cambria" w:hAnsi="Cambria"/>
           <w:b/>
+          <w:sz w:val="21"/>
+          <w:szCs w:val="21"/>
         </w:rPr>
         <w:t xml:space="preserve"> </w:t>
       </w:r>
       <w:r>
         <w:rPr>
           <w:rFonts w:ascii="Cambria" w:hAnsi="Cambria"/>
+          <w:sz w:val="21"/>
+          <w:szCs w:val="21"/>
         </w:rPr>
         <w:t>SEP 2022 to Present</w:t>
       </w:r>
@@ -886,12 +1218,16 @@
         <w:ind w:left="456"/>
         <w:rPr>
           <w:rFonts w:ascii="Cambria" w:hAnsi="Cambria"/>
-        </w:rPr>
-      </w:pPr>
-      <w:r>
-        <w:rPr>
-          <w:rFonts w:ascii="Cambria" w:hAnsi="Cambria"/>
-          <w:b/>
+          <w:sz w:val="21"/>
+          <w:szCs w:val="21"/>
+        </w:rPr>
+      </w:pPr>
+      <w:r>
+        <w:rPr>
+          <w:rFonts w:ascii="Cambria" w:hAnsi="Cambria"/>
+          <w:b/>
+          <w:sz w:val="21"/>
+          <w:szCs w:val="21"/>
         </w:rPr>
         <w:t>D</w:t>
       </w:r>
@@ -899,6 +1235,8 @@
         <w:rPr>
           <w:rFonts w:ascii="Cambria" w:hAnsi="Cambria"/>
           <w:b/>
+          <w:sz w:val="21"/>
+          <w:szCs w:val="21"/>
         </w:rPr>
         <w:t>escription</w:t>
       </w:r>
@@ -906,12 +1244,16 @@
         <w:rPr>
           <w:rFonts w:ascii="Cambria" w:hAnsi="Cambria"/>
           <w:b/>
+          <w:sz w:val="21"/>
+          <w:szCs w:val="21"/>
         </w:rPr>
         <w:t xml:space="preserve">: </w:t>
       </w:r>
       <w:r>
         <w:rPr>
           <w:rFonts w:ascii="Cambria" w:hAnsi="Cambria"/>
+          <w:sz w:val="21"/>
+          <w:szCs w:val="21"/>
         </w:rPr>
         <w:t>AEHM is a real-time aircraft engine health monitoring platform that processes telemetry data from aircraft engines globally. This system analyses parameters such as temperature, vibration and fuel efficiency to predict engine failures and enable proactive maintenance for airlines.</w:t>
       </w:r>
@@ -924,6 +1266,8 @@
         <w:rPr>
           <w:rFonts w:ascii="Cambria" w:hAnsi="Cambria"/>
           <w:b/>
+          <w:sz w:val="21"/>
+          <w:szCs w:val="21"/>
         </w:rPr>
       </w:pPr>
     </w:p>
@@ -939,13 +1283,34 @@
         <w:jc w:val="both"/>
         <w:rPr>
           <w:rFonts w:ascii="Cambria" w:hAnsi="Cambria"/>
-        </w:rPr>
-      </w:pPr>
-      <w:r>
-        <w:rPr>
-          <w:rFonts w:ascii="Cambria" w:hAnsi="Cambria"/>
-        </w:rPr>
-        <w:t>Designed and implemented CI/CD pipelines using Jenkins to automate application deployments and infrastructure provisioning, improving deployment speed for the applications.</w:t>
+          <w:sz w:val="21"/>
+          <w:szCs w:val="21"/>
+        </w:rPr>
+      </w:pPr>
+      <w:r>
+        <w:rPr>
+          <w:rFonts w:ascii="Cambria" w:hAnsi="Cambria"/>
+          <w:sz w:val="21"/>
+          <w:szCs w:val="21"/>
+        </w:rPr>
+        <w:lastRenderedPageBreak/>
+        <w:t xml:space="preserve">Designed and implemented Jenkins CI/CD pipelines using Multibranch Pipelines and Shared Libraries, automating build, test, and deployment workflows, reducing manual effort and accelerating release cycles across </w:t>
+      </w:r>
+      <w:r>
+        <w:rPr>
+          <w:rFonts w:ascii="Cambria" w:hAnsi="Cambria"/>
+          <w:sz w:val="21"/>
+          <w:szCs w:val="21"/>
+        </w:rPr>
+        <w:t xml:space="preserve">Dev, QA and Production </w:t>
+      </w:r>
+      <w:r>
+        <w:rPr>
+          <w:rFonts w:ascii="Cambria" w:hAnsi="Cambria"/>
+          <w:sz w:val="21"/>
+          <w:szCs w:val="21"/>
+        </w:rPr>
+        <w:t>environments</w:t>
       </w:r>
     </w:p>
     <w:p>
@@ -960,13 +1325,49 @@
         <w:jc w:val="both"/>
         <w:rPr>
           <w:rFonts w:ascii="Cambria" w:hAnsi="Cambria"/>
-        </w:rPr>
-      </w:pPr>
-      <w:r>
-        <w:rPr>
-          <w:rFonts w:ascii="Cambria" w:hAnsi="Cambria"/>
-        </w:rPr>
-        <w:t>Managed and provisioned cloud infrastructure across AWS, Azure, and GCP using Terraform IaC (Infrastructure as Code), reducing manual configuration errors</w:t>
+          <w:sz w:val="21"/>
+          <w:szCs w:val="21"/>
+        </w:rPr>
+      </w:pPr>
+      <w:r>
+        <w:rPr>
+          <w:rFonts w:ascii="Cambria" w:hAnsi="Cambria"/>
+          <w:sz w:val="21"/>
+          <w:szCs w:val="21"/>
+        </w:rPr>
+        <w:t>Automated AWS infrastructure provisioning using Terraform (modules, S3</w:t>
+      </w:r>
+      <w:r>
+        <w:rPr>
+          <w:rFonts w:ascii="Cambria" w:hAnsi="Cambria"/>
+          <w:sz w:val="21"/>
+          <w:szCs w:val="21"/>
+        </w:rPr>
+        <w:t xml:space="preserve"> </w:t>
+      </w:r>
+      <w:r>
+        <w:rPr>
+          <w:rFonts w:ascii="Cambria" w:hAnsi="Cambria"/>
+          <w:sz w:val="21"/>
+          <w:szCs w:val="21"/>
+        </w:rPr>
+        <w:t xml:space="preserve">backend, DynamoDB state locking) and Ansible (roles, reusable playbooks) </w:t>
+      </w:r>
+      <w:r>
+        <w:rPr>
+          <w:rFonts w:ascii="Cambria" w:hAnsi="Cambria"/>
+          <w:sz w:val="21"/>
+          <w:szCs w:val="21"/>
+        </w:rPr>
+        <w:t xml:space="preserve">for </w:t>
+      </w:r>
+      <w:r>
+        <w:rPr>
+          <w:rFonts w:ascii="Cambria" w:hAnsi="Cambria"/>
+          <w:sz w:val="21"/>
+          <w:szCs w:val="21"/>
+        </w:rPr>
+        <w:t>error-free deployments.</w:t>
       </w:r>
     </w:p>
     <w:p>
@@ -981,13 +1382,81 @@
         <w:jc w:val="both"/>
         <w:rPr>
           <w:rFonts w:ascii="Cambria" w:hAnsi="Cambria"/>
-        </w:rPr>
-      </w:pPr>
-      <w:r>
-        <w:rPr>
-          <w:rFonts w:ascii="Cambria" w:hAnsi="Cambria"/>
-        </w:rPr>
-        <w:t>Automated infrastructure provisioning and configuration using Terraform, Ansible and enabled consistent setup of virtual machines, databases, and application environments</w:t>
+          <w:sz w:val="21"/>
+          <w:szCs w:val="21"/>
+        </w:rPr>
+      </w:pPr>
+      <w:r>
+        <w:rPr>
+          <w:rFonts w:ascii="Cambria" w:hAnsi="Cambria"/>
+          <w:sz w:val="21"/>
+          <w:szCs w:val="21"/>
+        </w:rPr>
+        <w:t xml:space="preserve">Designed and implemented </w:t>
+      </w:r>
+      <w:r>
+        <w:rPr>
+          <w:rFonts w:ascii="Cambria" w:hAnsi="Cambria"/>
+          <w:sz w:val="21"/>
+          <w:szCs w:val="21"/>
+        </w:rPr>
+        <w:t xml:space="preserve">production-grade </w:t>
+      </w:r>
+      <w:r>
+        <w:rPr>
+          <w:rFonts w:ascii="Cambria" w:hAnsi="Cambria"/>
+          <w:sz w:val="21"/>
+          <w:szCs w:val="21"/>
+        </w:rPr>
+        <w:t xml:space="preserve">multi-region </w:t>
+      </w:r>
+      <w:r>
+        <w:rPr>
+          <w:rFonts w:ascii="Cambria" w:hAnsi="Cambria"/>
+          <w:sz w:val="21"/>
+          <w:szCs w:val="21"/>
+        </w:rPr>
+        <w:t>Kubernetes clusters</w:t>
+      </w:r>
+      <w:r>
+        <w:rPr>
+          <w:rFonts w:ascii="Cambria" w:hAnsi="Cambria"/>
+          <w:sz w:val="21"/>
+          <w:szCs w:val="21"/>
+        </w:rPr>
+        <w:t xml:space="preserve"> </w:t>
+      </w:r>
+      <w:r>
+        <w:rPr>
+          <w:rFonts w:ascii="Cambria" w:hAnsi="Cambria"/>
+          <w:sz w:val="21"/>
+          <w:szCs w:val="21"/>
+        </w:rPr>
+        <w:t xml:space="preserve">across </w:t>
+      </w:r>
+      <w:r>
+        <w:rPr>
+          <w:rFonts w:ascii="Cambria" w:hAnsi="Cambria"/>
+          <w:sz w:val="21"/>
+          <w:szCs w:val="21"/>
+        </w:rPr>
+        <w:t xml:space="preserve">AWS </w:t>
+      </w:r>
+      <w:r>
+        <w:rPr>
+          <w:rFonts w:ascii="Cambria" w:hAnsi="Cambria"/>
+          <w:sz w:val="21"/>
+          <w:szCs w:val="21"/>
+        </w:rPr>
+        <w:t>Public and GovCloud</w:t>
+      </w:r>
+      <w:r>
+        <w:rPr>
+          <w:rFonts w:ascii="Cambria" w:hAnsi="Cambria"/>
+          <w:sz w:val="21"/>
+          <w:szCs w:val="21"/>
+        </w:rPr>
+        <w:t xml:space="preserve"> for scalability and high availability of applications</w:t>
       </w:r>
     </w:p>
     <w:p>
@@ -1002,13 +1471,33 @@
         <w:jc w:val="both"/>
         <w:rPr>
           <w:rFonts w:ascii="Cambria" w:hAnsi="Cambria"/>
-        </w:rPr>
-      </w:pPr>
-      <w:r>
-        <w:rPr>
-          <w:rFonts w:ascii="Cambria" w:hAnsi="Cambria"/>
-        </w:rPr>
-        <w:t>Implemented monitoring and observability solutions using Prometheus, Grafana, and New Relic, enabling proactive issue detection and reduced the operational support tickets</w:t>
+          <w:sz w:val="21"/>
+          <w:szCs w:val="21"/>
+        </w:rPr>
+      </w:pPr>
+      <w:r>
+        <w:rPr>
+          <w:rFonts w:ascii="Cambria" w:hAnsi="Cambria"/>
+          <w:sz w:val="21"/>
+          <w:szCs w:val="21"/>
+        </w:rPr>
+        <w:t>B</w:t>
+      </w:r>
+      <w:r>
+        <w:rPr>
+          <w:rFonts w:ascii="Cambria" w:hAnsi="Cambria"/>
+          <w:sz w:val="21"/>
+          <w:szCs w:val="21"/>
+        </w:rPr>
+        <w:t>uilt Docker images and deployed containerized microservices to Amazon EKS</w:t>
+      </w:r>
+      <w:r>
+        <w:rPr>
+          <w:rFonts w:ascii="Cambria" w:hAnsi="Cambria"/>
+          <w:sz w:val="21"/>
+          <w:szCs w:val="21"/>
+        </w:rPr>
+        <w:t xml:space="preserve"> </w:t>
       </w:r>
     </w:p>
     <w:p>
@@ -1023,13 +1512,97 @@
         <w:jc w:val="both"/>
         <w:rPr>
           <w:rFonts w:ascii="Cambria" w:hAnsi="Cambria"/>
-        </w:rPr>
-      </w:pPr>
-      <w:r>
-        <w:rPr>
-          <w:rFonts w:ascii="Cambria" w:hAnsi="Cambria"/>
-        </w:rPr>
-        <w:t>Collaborated with development teams to streamline the Software Development Life Cycle (SDLC) by automating build, test, deployment, and environment provisioning processes</w:t>
+          <w:sz w:val="21"/>
+          <w:szCs w:val="21"/>
+        </w:rPr>
+      </w:pPr>
+      <w:r>
+        <w:rPr>
+          <w:rFonts w:ascii="Cambria" w:hAnsi="Cambria"/>
+          <w:sz w:val="21"/>
+          <w:szCs w:val="21"/>
+        </w:rPr>
+        <w:t>Implemented GitOps</w:t>
+      </w:r>
+      <w:r>
+        <w:rPr>
+          <w:rFonts w:ascii="Cambria" w:hAnsi="Cambria"/>
+          <w:sz w:val="21"/>
+          <w:szCs w:val="21"/>
+        </w:rPr>
+        <w:t>-</w:t>
+      </w:r>
+      <w:r>
+        <w:rPr>
+          <w:rFonts w:ascii="Cambria" w:hAnsi="Cambria"/>
+          <w:sz w:val="21"/>
+          <w:szCs w:val="21"/>
+        </w:rPr>
+        <w:t xml:space="preserve">based </w:t>
+      </w:r>
+      <w:r>
+        <w:rPr>
+          <w:rFonts w:ascii="Cambria" w:hAnsi="Cambria"/>
+          <w:sz w:val="21"/>
+          <w:szCs w:val="21"/>
+        </w:rPr>
+        <w:t>continuous delivery</w:t>
+      </w:r>
+      <w:r>
+        <w:rPr>
+          <w:rFonts w:ascii="Cambria" w:hAnsi="Cambria"/>
+          <w:sz w:val="21"/>
+          <w:szCs w:val="21"/>
+        </w:rPr>
+        <w:t xml:space="preserve"> using ArgoCD with Helm</w:t>
+      </w:r>
+      <w:r>
+        <w:rPr>
+          <w:rFonts w:ascii="Cambria" w:hAnsi="Cambria"/>
+          <w:sz w:val="21"/>
+          <w:szCs w:val="21"/>
+        </w:rPr>
+        <w:t>,</w:t>
+      </w:r>
+      <w:r>
+        <w:rPr>
+          <w:rFonts w:ascii="Cambria" w:hAnsi="Cambria"/>
+          <w:sz w:val="21"/>
+          <w:szCs w:val="21"/>
+        </w:rPr>
+        <w:t xml:space="preserve"> enabl</w:t>
+      </w:r>
+      <w:r>
+        <w:rPr>
+          <w:rFonts w:ascii="Cambria" w:hAnsi="Cambria"/>
+          <w:sz w:val="21"/>
+          <w:szCs w:val="21"/>
+        </w:rPr>
+        <w:t>ing</w:t>
+      </w:r>
+      <w:r>
+        <w:rPr>
+          <w:rFonts w:ascii="Cambria" w:hAnsi="Cambria"/>
+          <w:sz w:val="21"/>
+          <w:szCs w:val="21"/>
+        </w:rPr>
+        <w:t xml:space="preserve"> automated version-controlled releases across Dev, QA, and Prod</w:t>
+      </w:r>
+      <w:r>
+        <w:rPr>
+          <w:rFonts w:ascii="Cambria" w:hAnsi="Cambria"/>
+          <w:sz w:val="21"/>
+          <w:szCs w:val="21"/>
+        </w:rPr>
+        <w:t>uction</w:t>
+      </w:r>
+      <w:r>
+        <w:rPr>
+          <w:rFonts w:ascii="Cambria" w:hAnsi="Cambria"/>
+          <w:sz w:val="21"/>
+          <w:szCs w:val="21"/>
+        </w:rPr>
+        <w:t xml:space="preserve"> environments</w:t>
       </w:r>
     </w:p>
     <w:p>
@@ -1044,13 +1617,81 @@
         <w:jc w:val="both"/>
         <w:rPr>
           <w:rFonts w:ascii="Cambria" w:hAnsi="Cambria"/>
-        </w:rPr>
-      </w:pPr>
-      <w:r>
-        <w:rPr>
-          <w:rFonts w:ascii="Cambria" w:hAnsi="Cambria"/>
-        </w:rPr>
-        <w:t>Implemented secure DevOps practices, including secrets management using HashiCorp Vault, vulnerability scanning to enhance cloud security posture</w:t>
+          <w:sz w:val="21"/>
+          <w:szCs w:val="21"/>
+        </w:rPr>
+      </w:pPr>
+      <w:r>
+        <w:rPr>
+          <w:rFonts w:ascii="Cambria" w:hAnsi="Cambria"/>
+          <w:sz w:val="21"/>
+          <w:szCs w:val="21"/>
+        </w:rPr>
+        <w:t xml:space="preserve">Integrated DevSecOps practices </w:t>
+      </w:r>
+      <w:r>
+        <w:rPr>
+          <w:rFonts w:ascii="Cambria" w:hAnsi="Cambria"/>
+          <w:sz w:val="21"/>
+          <w:szCs w:val="21"/>
+        </w:rPr>
+        <w:t>by implementing</w:t>
+      </w:r>
+      <w:r>
+        <w:rPr>
+          <w:rFonts w:ascii="Cambria" w:hAnsi="Cambria"/>
+          <w:sz w:val="21"/>
+          <w:szCs w:val="21"/>
+        </w:rPr>
+        <w:t xml:space="preserve"> HashiCorp Vault for secrets management and SAST (Checkmarx), code quality </w:t>
+      </w:r>
+      <w:r>
+        <w:rPr>
+          <w:rFonts w:ascii="Cambria" w:hAnsi="Cambria"/>
+          <w:sz w:val="21"/>
+          <w:szCs w:val="21"/>
+        </w:rPr>
+        <w:t>gates</w:t>
+      </w:r>
+      <w:r>
+        <w:rPr>
+          <w:rFonts w:ascii="Cambria" w:hAnsi="Cambria"/>
+          <w:sz w:val="21"/>
+          <w:szCs w:val="21"/>
+        </w:rPr>
+        <w:t xml:space="preserve"> (SonarQube)</w:t>
+      </w:r>
+      <w:r>
+        <w:rPr>
+          <w:rFonts w:ascii="Cambria" w:hAnsi="Cambria"/>
+          <w:sz w:val="21"/>
+          <w:szCs w:val="21"/>
+        </w:rPr>
+        <w:t>,</w:t>
+      </w:r>
+      <w:r>
+        <w:rPr>
+          <w:rFonts w:ascii="Cambria" w:hAnsi="Cambria"/>
+          <w:sz w:val="21"/>
+          <w:szCs w:val="21"/>
+        </w:rPr>
+        <w:t xml:space="preserve"> and container scanning (Trivy) into CI/CD pipelines</w:t>
+      </w:r>
+      <w:r>
+        <w:rPr>
+          <w:rFonts w:ascii="Cambria" w:hAnsi="Cambria"/>
+          <w:sz w:val="21"/>
+          <w:szCs w:val="21"/>
+        </w:rPr>
+        <w:t xml:space="preserve"> by</w:t>
+      </w:r>
+      <w:r>
+        <w:rPr>
+          <w:rFonts w:ascii="Cambria" w:hAnsi="Cambria"/>
+          <w:sz w:val="21"/>
+          <w:szCs w:val="21"/>
+        </w:rPr>
+        <w:t xml:space="preserve"> enhancing cloud security</w:t>
       </w:r>
     </w:p>
     <w:p>
@@ -1065,13 +1706,25 @@
         <w:jc w:val="both"/>
         <w:rPr>
           <w:rFonts w:ascii="Cambria" w:hAnsi="Cambria"/>
-        </w:rPr>
-      </w:pPr>
-      <w:r>
-        <w:rPr>
-          <w:rFonts w:ascii="Cambria" w:hAnsi="Cambria"/>
-        </w:rPr>
-        <w:t>Provided production support and incident management, performing root cause analysis (RCA) and troubleshooting to maintain systems uptime and improve system reliability</w:t>
+          <w:sz w:val="21"/>
+          <w:szCs w:val="21"/>
+        </w:rPr>
+      </w:pPr>
+      <w:r>
+        <w:rPr>
+          <w:rFonts w:ascii="Cambria" w:hAnsi="Cambria"/>
+          <w:sz w:val="21"/>
+          <w:szCs w:val="21"/>
+        </w:rPr>
+        <w:t>Configured</w:t>
+      </w:r>
+      <w:r>
+        <w:rPr>
+          <w:rFonts w:ascii="Cambria" w:hAnsi="Cambria"/>
+          <w:sz w:val="21"/>
+          <w:szCs w:val="21"/>
+        </w:rPr>
+        <w:t xml:space="preserve"> Istio Authorization Policies and Peer Authentication to enable mTLS-based secure service-to-service communication in Kubernetes.</w:t>
       </w:r>
     </w:p>
     <w:p>
@@ -1086,13 +1739,17 @@
         <w:jc w:val="both"/>
         <w:rPr>
           <w:rFonts w:ascii="Cambria" w:hAnsi="Cambria"/>
-        </w:rPr>
-      </w:pPr>
-      <w:r>
-        <w:rPr>
-          <w:rFonts w:ascii="Cambria" w:hAnsi="Cambria"/>
-        </w:rPr>
-        <w:t>Enabled Notifications using Lambda, SNS and Event Bridge to get alerts for AWS Maintenance</w:t>
+          <w:sz w:val="21"/>
+          <w:szCs w:val="21"/>
+        </w:rPr>
+      </w:pPr>
+      <w:r>
+        <w:rPr>
+          <w:rFonts w:ascii="Cambria" w:hAnsi="Cambria"/>
+          <w:sz w:val="21"/>
+          <w:szCs w:val="21"/>
+        </w:rPr>
+        <w:t>Managed production support and incident response by resolving ServiceNow P1/P2 incidents, participating in war room calls, and performing root cause analysis (RCA) to ensure system stability</w:t>
       </w:r>
     </w:p>
     <w:p>
@@ -1107,13 +1764,137 @@
         <w:jc w:val="both"/>
         <w:rPr>
           <w:rFonts w:ascii="Cambria" w:hAnsi="Cambria"/>
-        </w:rPr>
-      </w:pPr>
-      <w:r>
-        <w:rPr>
-          <w:rFonts w:ascii="Cambria" w:hAnsi="Cambria"/>
-        </w:rPr>
-        <w:t>Maintained AWS GovCloud for uninterrupted application functionality</w:t>
+          <w:sz w:val="21"/>
+          <w:szCs w:val="21"/>
+        </w:rPr>
+      </w:pPr>
+      <w:r>
+        <w:rPr>
+          <w:rFonts w:ascii="Cambria" w:hAnsi="Cambria"/>
+          <w:sz w:val="21"/>
+          <w:szCs w:val="21"/>
+        </w:rPr>
+        <w:t xml:space="preserve">Automated IAM security and system maintenance </w:t>
+      </w:r>
+      <w:r>
+        <w:rPr>
+          <w:rFonts w:ascii="Cambria" w:hAnsi="Cambria"/>
+          <w:sz w:val="21"/>
+          <w:szCs w:val="21"/>
+        </w:rPr>
+        <w:t>using</w:t>
+      </w:r>
+      <w:r>
+        <w:rPr>
+          <w:rFonts w:ascii="Cambria" w:hAnsi="Cambria"/>
+          <w:sz w:val="21"/>
+          <w:szCs w:val="21"/>
+        </w:rPr>
+        <w:t xml:space="preserve"> Python and </w:t>
+      </w:r>
+      <w:r>
+        <w:rPr>
+          <w:rFonts w:ascii="Cambria" w:hAnsi="Cambria"/>
+          <w:sz w:val="21"/>
+          <w:szCs w:val="21"/>
+        </w:rPr>
+        <w:t>s</w:t>
+      </w:r>
+      <w:r>
+        <w:rPr>
+          <w:rFonts w:ascii="Cambria" w:hAnsi="Cambria"/>
+          <w:sz w:val="21"/>
+          <w:szCs w:val="21"/>
+        </w:rPr>
+        <w:t>hell scripts to identify overly permissive policies</w:t>
+      </w:r>
+      <w:r>
+        <w:rPr>
+          <w:rFonts w:ascii="Cambria" w:hAnsi="Cambria"/>
+          <w:sz w:val="21"/>
+          <w:szCs w:val="21"/>
+        </w:rPr>
+        <w:t xml:space="preserve"> and </w:t>
+      </w:r>
+      <w:r>
+        <w:rPr>
+          <w:rFonts w:ascii="Cambria" w:hAnsi="Cambria"/>
+          <w:sz w:val="21"/>
+          <w:szCs w:val="21"/>
+        </w:rPr>
+        <w:t>enforce least-privilege access</w:t>
+      </w:r>
+      <w:r>
+        <w:rPr>
+          <w:rFonts w:ascii="Cambria" w:hAnsi="Cambria"/>
+          <w:sz w:val="21"/>
+          <w:szCs w:val="21"/>
+        </w:rPr>
+        <w:t xml:space="preserve"> to users </w:t>
+      </w:r>
+      <w:r>
+        <w:rPr>
+          <w:rFonts w:ascii="Cambria" w:hAnsi="Cambria"/>
+          <w:sz w:val="21"/>
+          <w:szCs w:val="21"/>
+        </w:rPr>
+        <w:t xml:space="preserve">and </w:t>
+      </w:r>
+      <w:r>
+        <w:rPr>
+          <w:rFonts w:ascii="Cambria" w:hAnsi="Cambria"/>
+          <w:sz w:val="21"/>
+          <w:szCs w:val="21"/>
+        </w:rPr>
+        <w:t>optimized</w:t>
+      </w:r>
+      <w:r>
+        <w:rPr>
+          <w:rFonts w:ascii="Cambria" w:hAnsi="Cambria"/>
+          <w:sz w:val="21"/>
+          <w:szCs w:val="21"/>
+        </w:rPr>
+        <w:t xml:space="preserve"> disk space clean-up </w:t>
+      </w:r>
+      <w:r>
+        <w:rPr>
+          <w:rFonts w:ascii="Cambria" w:hAnsi="Cambria"/>
+          <w:sz w:val="21"/>
+          <w:szCs w:val="21"/>
+        </w:rPr>
+        <w:t xml:space="preserve">using </w:t>
+      </w:r>
+      <w:r>
+        <w:rPr>
+          <w:rFonts w:ascii="Cambria" w:hAnsi="Cambria"/>
+          <w:sz w:val="21"/>
+          <w:szCs w:val="21"/>
+        </w:rPr>
+        <w:t xml:space="preserve">automated purge scripts, improving security and </w:t>
+      </w:r>
+      <w:r>
+        <w:rPr>
+          <w:rFonts w:ascii="Cambria" w:hAnsi="Cambria"/>
+          <w:sz w:val="21"/>
+          <w:szCs w:val="21"/>
+        </w:rPr>
+        <w:t>reduced manual effort</w:t>
+      </w:r>
+      <w:r>
+        <w:rPr>
+          <w:rFonts w:ascii="Cambria" w:hAnsi="Cambria"/>
+          <w:sz w:val="21"/>
+          <w:szCs w:val="21"/>
+        </w:rPr>
+        <w:t xml:space="preserve"> by 60%</w:t>
+      </w:r>
+      <w:r>
+        <w:rPr>
+          <w:rFonts w:ascii="Cambria" w:hAnsi="Cambria"/>
+          <w:sz w:val="21"/>
+          <w:szCs w:val="21"/>
+        </w:rPr>
+        <w:t>.</w:t>
       </w:r>
     </w:p>
     <w:p>
@@ -1128,13 +1909,115 @@
         <w:jc w:val="both"/>
         <w:rPr>
           <w:rFonts w:ascii="Cambria" w:hAnsi="Cambria"/>
-        </w:rPr>
-      </w:pPr>
-      <w:r>
-        <w:rPr>
-          <w:rFonts w:ascii="Cambria" w:hAnsi="Cambria"/>
-        </w:rPr>
-        <w:t>Implemented proactive monitoring and alerting systems with CloudWatch, setting up monitors alarms and notifications for application reliability and performance standards</w:t>
+          <w:sz w:val="21"/>
+          <w:szCs w:val="21"/>
+        </w:rPr>
+      </w:pPr>
+      <w:r>
+        <w:rPr>
+          <w:rFonts w:ascii="Cambria" w:hAnsi="Cambria"/>
+          <w:sz w:val="21"/>
+          <w:szCs w:val="21"/>
+        </w:rPr>
+        <w:t>I</w:t>
+      </w:r>
+      <w:r>
+        <w:rPr>
+          <w:rFonts w:ascii="Cambria" w:hAnsi="Cambria"/>
+          <w:sz w:val="21"/>
+          <w:szCs w:val="21"/>
+        </w:rPr>
+        <w:t>mplement</w:t>
+      </w:r>
+      <w:r>
+        <w:rPr>
+          <w:rFonts w:ascii="Cambria" w:hAnsi="Cambria"/>
+          <w:sz w:val="21"/>
+          <w:szCs w:val="21"/>
+        </w:rPr>
+        <w:t>ed</w:t>
+      </w:r>
+      <w:r>
+        <w:rPr>
+          <w:rFonts w:ascii="Cambria" w:hAnsi="Cambria"/>
+          <w:sz w:val="21"/>
+          <w:szCs w:val="21"/>
+        </w:rPr>
+        <w:t xml:space="preserve"> KMS</w:t>
+      </w:r>
+      <w:r>
+        <w:rPr>
+          <w:rFonts w:ascii="Cambria" w:hAnsi="Cambria"/>
+          <w:sz w:val="21"/>
+          <w:szCs w:val="21"/>
+        </w:rPr>
+        <w:t xml:space="preserve">-based </w:t>
+      </w:r>
+      <w:r>
+        <w:rPr>
+          <w:rFonts w:ascii="Cambria" w:hAnsi="Cambria"/>
+          <w:sz w:val="21"/>
+          <w:szCs w:val="21"/>
+        </w:rPr>
+        <w:t xml:space="preserve">encryption </w:t>
+      </w:r>
+      <w:r>
+        <w:rPr>
+          <w:rFonts w:ascii="Cambria" w:hAnsi="Cambria"/>
+          <w:sz w:val="21"/>
+          <w:szCs w:val="21"/>
+        </w:rPr>
+        <w:t xml:space="preserve">for EBS, RDS to secure data at rest </w:t>
+      </w:r>
+    </w:p>
+    <w:p>
+      <w:pPr>
+        <w:pStyle w:val="ListParagraph"/>
+        <w:numPr>
+          <w:ilvl w:val="0"/>
+          <w:numId w:val="3"/>
+        </w:numPr>
+        <w:spacing w:after="0"/>
+        <w:ind w:left="609"/>
+        <w:jc w:val="both"/>
+        <w:rPr>
+          <w:rFonts w:ascii="Cambria" w:hAnsi="Cambria"/>
+          <w:sz w:val="21"/>
+          <w:szCs w:val="21"/>
+        </w:rPr>
+      </w:pPr>
+      <w:r>
+        <w:rPr>
+          <w:rFonts w:ascii="Cambria" w:hAnsi="Cambria"/>
+          <w:sz w:val="21"/>
+          <w:szCs w:val="21"/>
+        </w:rPr>
+        <w:t>Implemented event-driven automation for RDS maintenance using AWS Lambda, SNS, and EventBridge to enhance operational efficiency</w:t>
+      </w:r>
+    </w:p>
+    <w:p>
+      <w:pPr>
+        <w:pStyle w:val="ListParagraph"/>
+        <w:numPr>
+          <w:ilvl w:val="0"/>
+          <w:numId w:val="3"/>
+        </w:numPr>
+        <w:spacing w:after="0"/>
+        <w:ind w:left="609"/>
+        <w:jc w:val="both"/>
+        <w:rPr>
+          <w:rFonts w:ascii="Cambria" w:hAnsi="Cambria"/>
+          <w:sz w:val="21"/>
+          <w:szCs w:val="21"/>
+        </w:rPr>
+      </w:pPr>
+      <w:r>
+        <w:rPr>
+          <w:rFonts w:ascii="Cambria" w:hAnsi="Cambria"/>
+          <w:sz w:val="21"/>
+          <w:szCs w:val="21"/>
+        </w:rPr>
+        <w:t>Implemented monitoring and observability solutions using Prometheus, Grafana, New Relic, and CloudWatch to cover metrics, logging, and tracing, enabling proactive alerting and early issue detection.</w:t>
       </w:r>
     </w:p>
     <w:p>
@@ -1160,24 +2043,32 @@
         <w:rPr>
           <w:rFonts w:ascii="Cambria" w:hAnsi="Cambria"/>
           <w:b/>
-        </w:rPr>
-      </w:pPr>
-      <w:r>
-        <w:rPr>
-          <w:rFonts w:ascii="Cambria" w:hAnsi="Cambria"/>
-          <w:b/>
+          <w:sz w:val="21"/>
+          <w:szCs w:val="21"/>
+        </w:rPr>
+      </w:pPr>
+      <w:r>
+        <w:rPr>
+          <w:rFonts w:ascii="Cambria" w:hAnsi="Cambria"/>
+          <w:b/>
+          <w:sz w:val="21"/>
+          <w:szCs w:val="21"/>
         </w:rPr>
         <w:t xml:space="preserve">Title: </w:t>
       </w:r>
       <w:r>
         <w:rPr>
           <w:rFonts w:ascii="Cambria" w:hAnsi="Cambria"/>
+          <w:sz w:val="21"/>
+          <w:szCs w:val="21"/>
         </w:rPr>
         <w:t>GE</w:t>
       </w:r>
       <w:r>
         <w:rPr>
           <w:rFonts w:ascii="Cambria" w:hAnsi="Cambria"/>
+          <w:sz w:val="21"/>
+          <w:szCs w:val="21"/>
         </w:rPr>
         <w:t>AV-DB MIGRATION</w:t>
       </w:r>
@@ -1191,18 +2082,24 @@
         <w:rPr>
           <w:rFonts w:ascii="Cambria" w:hAnsi="Cambria"/>
           <w:b/>
-        </w:rPr>
-      </w:pPr>
-      <w:r>
-        <w:rPr>
-          <w:rFonts w:ascii="Cambria" w:hAnsi="Cambria"/>
-          <w:b/>
+          <w:sz w:val="21"/>
+          <w:szCs w:val="21"/>
+        </w:rPr>
+      </w:pPr>
+      <w:r>
+        <w:rPr>
+          <w:rFonts w:ascii="Cambria" w:hAnsi="Cambria"/>
+          <w:b/>
+          <w:sz w:val="21"/>
+          <w:szCs w:val="21"/>
         </w:rPr>
         <w:t xml:space="preserve">Duration: </w:t>
       </w:r>
       <w:r>
         <w:rPr>
           <w:rFonts w:ascii="Cambria" w:hAnsi="Cambria"/>
+          <w:sz w:val="21"/>
+          <w:szCs w:val="21"/>
         </w:rPr>
         <w:t>MAR 2022 to SEP 2022</w:t>
       </w:r>
@@ -1215,18 +2112,24 @@
         <w:jc w:val="both"/>
         <w:rPr>
           <w:rFonts w:ascii="Cambria" w:hAnsi="Cambria"/>
-        </w:rPr>
-      </w:pPr>
-      <w:r>
-        <w:rPr>
-          <w:rFonts w:ascii="Cambria" w:hAnsi="Cambria"/>
-          <w:b/>
+          <w:sz w:val="21"/>
+          <w:szCs w:val="21"/>
+        </w:rPr>
+      </w:pPr>
+      <w:r>
+        <w:rPr>
+          <w:rFonts w:ascii="Cambria" w:hAnsi="Cambria"/>
+          <w:b/>
+          <w:sz w:val="21"/>
+          <w:szCs w:val="21"/>
         </w:rPr>
         <w:t xml:space="preserve">Description: </w:t>
       </w:r>
       <w:r>
         <w:rPr>
           <w:rFonts w:ascii="Cambria" w:hAnsi="Cambria"/>
+          <w:sz w:val="21"/>
+          <w:szCs w:val="21"/>
         </w:rPr>
         <w:t>The project is involved in migrating multiple on-premise to oracle databases (11g, 12c &amp; 19c) to AWS RDS</w:t>
       </w:r>
@@ -1255,13 +2158,17 @@
         <w:jc w:val="both"/>
         <w:rPr>
           <w:rFonts w:ascii="Cambria" w:hAnsi="Cambria"/>
-        </w:rPr>
-      </w:pPr>
-      <w:r>
-        <w:rPr>
-          <w:rFonts w:ascii="Cambria" w:hAnsi="Cambria"/>
-        </w:rPr>
-        <w:t>Collaborated with DBA teams to migrate multiple versions of Oracle databases from on-premise environment to AWS RDS using oracle Datapump (expdp/impdp)</w:t>
+          <w:sz w:val="21"/>
+          <w:szCs w:val="21"/>
+        </w:rPr>
+      </w:pPr>
+      <w:r>
+        <w:rPr>
+          <w:rFonts w:ascii="Cambria" w:hAnsi="Cambria"/>
+          <w:sz w:val="21"/>
+          <w:szCs w:val="21"/>
+        </w:rPr>
+        <w:t>Migrated Oracle databases from on-premises to AWS (GOV/Public) RDS using Data Pump (expdp/impdp) and managed secure dump transfers via S3 for reliable data migration</w:t>
       </w:r>
     </w:p>
     <w:p>
@@ -1276,13 +2183,17 @@
         <w:jc w:val="both"/>
         <w:rPr>
           <w:rFonts w:ascii="Cambria" w:hAnsi="Cambria"/>
-        </w:rPr>
-      </w:pPr>
-      <w:r>
-        <w:rPr>
-          <w:rFonts w:ascii="Cambria" w:hAnsi="Cambria"/>
-        </w:rPr>
-        <w:t>Assisted in planning and executing database migration activities including the dump file transfer and post migration validation</w:t>
+          <w:sz w:val="21"/>
+          <w:szCs w:val="21"/>
+        </w:rPr>
+      </w:pPr>
+      <w:r>
+        <w:rPr>
+          <w:rFonts w:ascii="Cambria" w:hAnsi="Cambria"/>
+          <w:sz w:val="21"/>
+          <w:szCs w:val="21"/>
+        </w:rPr>
+        <w:t>Implemented monitoring and performance tracking using CloudWatch, Oracle OEM, Redgate and enabled event-driven alerts using Lambda, SNS, and EventBridge for proactive issue detection</w:t>
       </w:r>
     </w:p>
     <w:p>
@@ -1297,13 +2208,25 @@
         <w:jc w:val="both"/>
         <w:rPr>
           <w:rFonts w:ascii="Cambria" w:hAnsi="Cambria"/>
-        </w:rPr>
-      </w:pPr>
-      <w:r>
-        <w:rPr>
-          <w:rFonts w:ascii="Cambria" w:hAnsi="Cambria"/>
-        </w:rPr>
-        <w:t>Configured AWS RDS instances with appropriate parameter groups, storage configurations and Multi-AZ deployment to ensure high availability and fault tolerance</w:t>
+          <w:sz w:val="21"/>
+          <w:szCs w:val="21"/>
+        </w:rPr>
+      </w:pPr>
+      <w:r>
+        <w:rPr>
+          <w:rFonts w:ascii="Cambria" w:hAnsi="Cambria"/>
+          <w:sz w:val="21"/>
+          <w:szCs w:val="21"/>
+        </w:rPr>
+        <w:t>P</w:t>
+      </w:r>
+      <w:r>
+        <w:rPr>
+          <w:rFonts w:ascii="Cambria" w:hAnsi="Cambria"/>
+          <w:sz w:val="21"/>
+          <w:szCs w:val="21"/>
+        </w:rPr>
+        <w:t>erformed AWS-to-AWS migrations using snapshot-based restores for high availability and disaster recovery</w:t>
       </w:r>
     </w:p>
     <w:p>
@@ -1318,14 +2241,25 @@
         <w:jc w:val="both"/>
         <w:rPr>
           <w:rFonts w:ascii="Cambria" w:hAnsi="Cambria"/>
-        </w:rPr>
-      </w:pPr>
-      <w:r>
-        <w:rPr>
-          <w:rFonts w:ascii="Cambria" w:hAnsi="Cambria"/>
-        </w:rPr>
-        <w:lastRenderedPageBreak/>
-        <w:t>Managed secure transfer of data pump files using AWS S3, enabling reliable export and import between databases and RDS environments</w:t>
+          <w:sz w:val="21"/>
+          <w:szCs w:val="21"/>
+        </w:rPr>
+      </w:pPr>
+      <w:r>
+        <w:rPr>
+          <w:rFonts w:ascii="Cambria" w:hAnsi="Cambria"/>
+          <w:sz w:val="21"/>
+          <w:szCs w:val="21"/>
+        </w:rPr>
+        <w:t>Designed</w:t>
+      </w:r>
+      <w:r>
+        <w:rPr>
+          <w:rFonts w:ascii="Cambria" w:hAnsi="Cambria"/>
+          <w:sz w:val="21"/>
+          <w:szCs w:val="21"/>
+        </w:rPr>
+        <w:t xml:space="preserve"> secure connectivity between on-premises and AWS using SSH tunneling</w:t>
       </w:r>
     </w:p>
     <w:p>
@@ -1340,13 +2274,105 @@
         <w:jc w:val="both"/>
         <w:rPr>
           <w:rFonts w:ascii="Cambria" w:hAnsi="Cambria"/>
-        </w:rPr>
-      </w:pPr>
-      <w:r>
-        <w:rPr>
-          <w:rFonts w:ascii="Cambria" w:hAnsi="Cambria"/>
-        </w:rPr>
-        <w:t>Configured AWS S3 buckets and access permissions for Datapump directories to securely store and manage the database dump files</w:t>
+          <w:sz w:val="21"/>
+          <w:szCs w:val="21"/>
+        </w:rPr>
+      </w:pPr>
+      <w:r>
+        <w:rPr>
+          <w:rFonts w:ascii="Cambria" w:hAnsi="Cambria"/>
+          <w:sz w:val="21"/>
+          <w:szCs w:val="21"/>
+        </w:rPr>
+        <w:t>Managed</w:t>
+      </w:r>
+      <w:r>
+        <w:rPr>
+          <w:rFonts w:ascii="Cambria" w:hAnsi="Cambria"/>
+          <w:sz w:val="21"/>
+          <w:szCs w:val="21"/>
+        </w:rPr>
+        <w:t xml:space="preserve"> security groups and </w:t>
+      </w:r>
+      <w:r>
+        <w:rPr>
+          <w:rFonts w:ascii="Cambria" w:hAnsi="Cambria"/>
+          <w:sz w:val="21"/>
+          <w:szCs w:val="21"/>
+        </w:rPr>
+        <w:t xml:space="preserve">implemented </w:t>
+      </w:r>
+      <w:r>
+        <w:rPr>
+          <w:rFonts w:ascii="Cambria" w:hAnsi="Cambria"/>
+          <w:sz w:val="21"/>
+          <w:szCs w:val="21"/>
+        </w:rPr>
+        <w:t xml:space="preserve">IP whitelisting </w:t>
+      </w:r>
+      <w:r>
+        <w:rPr>
+          <w:rFonts w:ascii="Cambria" w:hAnsi="Cambria"/>
+          <w:sz w:val="21"/>
+          <w:szCs w:val="21"/>
+        </w:rPr>
+        <w:t>to</w:t>
+      </w:r>
+      <w:r>
+        <w:rPr>
+          <w:rFonts w:ascii="Cambria" w:hAnsi="Cambria"/>
+          <w:sz w:val="21"/>
+          <w:szCs w:val="21"/>
+        </w:rPr>
+        <w:t xml:space="preserve"> ensur</w:t>
+      </w:r>
+      <w:r>
+        <w:rPr>
+          <w:rFonts w:ascii="Cambria" w:hAnsi="Cambria"/>
+          <w:sz w:val="21"/>
+          <w:szCs w:val="21"/>
+        </w:rPr>
+        <w:t>e</w:t>
+      </w:r>
+      <w:r>
+        <w:rPr>
+          <w:rFonts w:ascii="Cambria" w:hAnsi="Cambria"/>
+          <w:sz w:val="21"/>
+          <w:szCs w:val="21"/>
+        </w:rPr>
+        <w:t xml:space="preserve"> controlled and secure </w:t>
+      </w:r>
+      <w:r>
+        <w:rPr>
+          <w:rFonts w:ascii="Cambria" w:hAnsi="Cambria"/>
+          <w:sz w:val="21"/>
+          <w:szCs w:val="21"/>
+        </w:rPr>
+        <w:t xml:space="preserve">access </w:t>
+      </w:r>
+      <w:r>
+        <w:rPr>
+          <w:rFonts w:ascii="Cambria" w:hAnsi="Cambria"/>
+          <w:sz w:val="21"/>
+          <w:szCs w:val="21"/>
+        </w:rPr>
+        <w:t xml:space="preserve">to </w:t>
+      </w:r>
+      <w:r>
+        <w:rPr>
+          <w:rFonts w:ascii="Cambria" w:hAnsi="Cambria"/>
+          <w:sz w:val="21"/>
+          <w:szCs w:val="21"/>
+        </w:rPr>
+        <w:t>database</w:t>
+      </w:r>
+      <w:r>
+        <w:rPr>
+          <w:rFonts w:ascii="Cambria" w:hAnsi="Cambria"/>
+          <w:sz w:val="21"/>
+          <w:szCs w:val="21"/>
+        </w:rPr>
+        <w:t xml:space="preserve"> systems</w:t>
       </w:r>
     </w:p>
     <w:p>
@@ -1361,13 +2387,97 @@
         <w:jc w:val="both"/>
         <w:rPr>
           <w:rFonts w:ascii="Cambria" w:hAnsi="Cambria"/>
-        </w:rPr>
-      </w:pPr>
-      <w:r>
-        <w:rPr>
-          <w:rFonts w:ascii="Cambria" w:hAnsi="Cambria"/>
-        </w:rPr>
-        <w:t>Implemented IP whitelisting and security group configurations to allow controlled application connectivity to RDS databases and applications</w:t>
+          <w:sz w:val="21"/>
+          <w:szCs w:val="21"/>
+        </w:rPr>
+      </w:pPr>
+      <w:r>
+        <w:rPr>
+          <w:rFonts w:ascii="Cambria" w:hAnsi="Cambria"/>
+          <w:sz w:val="21"/>
+          <w:szCs w:val="21"/>
+        </w:rPr>
+        <w:t>Develop</w:t>
+      </w:r>
+      <w:r>
+        <w:rPr>
+          <w:rFonts w:ascii="Cambria" w:hAnsi="Cambria"/>
+          <w:sz w:val="21"/>
+          <w:szCs w:val="21"/>
+        </w:rPr>
+        <w:t>ed</w:t>
+      </w:r>
+      <w:r>
+        <w:rPr>
+          <w:rFonts w:ascii="Cambria" w:hAnsi="Cambria"/>
+          <w:sz w:val="21"/>
+          <w:szCs w:val="21"/>
+        </w:rPr>
+        <w:t xml:space="preserve"> Shell Script to automate operational tasks including</w:t>
+      </w:r>
+      <w:r>
+        <w:rPr>
+          <w:rFonts w:ascii="Cambria" w:hAnsi="Cambria"/>
+          <w:sz w:val="21"/>
+          <w:szCs w:val="21"/>
+        </w:rPr>
+        <w:t xml:space="preserve"> </w:t>
+      </w:r>
+      <w:r>
+        <w:rPr>
+          <w:rFonts w:ascii="Cambria" w:hAnsi="Cambria"/>
+          <w:sz w:val="21"/>
+          <w:szCs w:val="21"/>
+        </w:rPr>
+        <w:t xml:space="preserve">log </w:t>
+      </w:r>
+      <w:r>
+        <w:rPr>
+          <w:rFonts w:ascii="Cambria" w:hAnsi="Cambria"/>
+          <w:sz w:val="21"/>
+          <w:szCs w:val="21"/>
+        </w:rPr>
+        <w:t>rotation, maintenance</w:t>
+      </w:r>
+      <w:r>
+        <w:rPr>
+          <w:rFonts w:ascii="Cambria" w:hAnsi="Cambria"/>
+          <w:sz w:val="21"/>
+          <w:szCs w:val="21"/>
+        </w:rPr>
+        <w:t xml:space="preserve"> and </w:t>
+      </w:r>
+      <w:r>
+        <w:rPr>
+          <w:rFonts w:ascii="Cambria" w:hAnsi="Cambria"/>
+          <w:sz w:val="21"/>
+          <w:szCs w:val="21"/>
+        </w:rPr>
+        <w:t>patching</w:t>
+      </w:r>
+      <w:r>
+        <w:rPr>
+          <w:rFonts w:ascii="Cambria" w:hAnsi="Cambria"/>
+          <w:sz w:val="21"/>
+          <w:szCs w:val="21"/>
+        </w:rPr>
+        <w:t xml:space="preserve"> activities and </w:t>
+      </w:r>
+      <w:r>
+        <w:rPr>
+          <w:rFonts w:ascii="Cambria" w:hAnsi="Cambria"/>
+          <w:sz w:val="21"/>
+          <w:szCs w:val="21"/>
+        </w:rPr>
+        <w:t>clean-up</w:t>
+      </w:r>
+      <w:r>
+        <w:rPr>
+          <w:rFonts w:ascii="Cambria" w:hAnsi="Cambria"/>
+          <w:sz w:val="21"/>
+          <w:szCs w:val="21"/>
+        </w:rPr>
+        <w:t xml:space="preserve"> of backup dumps older than retention period</w:t>
       </w:r>
     </w:p>
     <w:p>
@@ -1382,13 +2492,17 @@
         <w:jc w:val="both"/>
         <w:rPr>
           <w:rFonts w:ascii="Cambria" w:hAnsi="Cambria"/>
-        </w:rPr>
-      </w:pPr>
-      <w:r>
-        <w:rPr>
-          <w:rFonts w:ascii="Cambria" w:hAnsi="Cambria"/>
-        </w:rPr>
-        <w:t>Established secure connectivity between on-premise infrastructure and AWS environments using SSH Tunnelling</w:t>
+          <w:sz w:val="21"/>
+          <w:szCs w:val="21"/>
+        </w:rPr>
+      </w:pPr>
+      <w:r>
+        <w:rPr>
+          <w:rFonts w:ascii="Cambria" w:hAnsi="Cambria"/>
+          <w:sz w:val="21"/>
+          <w:szCs w:val="21"/>
+        </w:rPr>
+        <w:t>Supported vulnerability remediation activities and performed SSH key rotations for on-premise servers to address vulnerability findings</w:t>
       </w:r>
     </w:p>
     <w:p>
@@ -1408,31 +2522,103 @@
       <w:r>
         <w:rPr>
           <w:rFonts w:ascii="Cambria" w:hAnsi="Cambria"/>
-        </w:rPr>
-        <w:t xml:space="preserve">Develops scripts using Python and Shell Script to automate operational tasks including log rotation, Monthly maintenance activities and </w:t>
-      </w:r>
-      <w:proofErr w:type="spellStart"/>
-      <w:r>
-        <w:rPr>
-          <w:rFonts w:ascii="Cambria" w:hAnsi="Cambria"/>
-        </w:rPr>
-        <w:t>cleanup</w:t>
-      </w:r>
-      <w:proofErr w:type="spellEnd"/>
-      <w:r>
-        <w:rPr>
-          <w:rFonts w:ascii="Cambria" w:hAnsi="Cambria"/>
-        </w:rPr>
-        <w:t xml:space="preserve"> of backup dumps older than retention period</w:t>
-      </w:r>
-    </w:p>
-    <w:p>
-      <w:pPr>
-        <w:pStyle w:val="ListParagraph"/>
-        <w:numPr>
-          <w:ilvl w:val="0"/>
-          <w:numId w:val="4"/>
-        </w:numPr>
+          <w:sz w:val="21"/>
+          <w:szCs w:val="21"/>
+        </w:rPr>
+        <w:t>Collaborated with application teams to update database endpoints</w:t>
+      </w:r>
+      <w:r>
+        <w:rPr>
+          <w:rFonts w:ascii="Cambria" w:hAnsi="Cambria"/>
+          <w:sz w:val="21"/>
+          <w:szCs w:val="21"/>
+        </w:rPr>
+        <w:t xml:space="preserve"> and </w:t>
+      </w:r>
+      <w:r>
+        <w:rPr>
+          <w:rFonts w:ascii="Cambria" w:hAnsi="Cambria"/>
+          <w:sz w:val="21"/>
+          <w:szCs w:val="21"/>
+        </w:rPr>
+        <w:t>validate post-migration</w:t>
+      </w:r>
+      <w:r>
+        <w:rPr>
+          <w:rFonts w:ascii="Cambria" w:hAnsi="Cambria"/>
+          <w:sz w:val="21"/>
+          <w:szCs w:val="21"/>
+        </w:rPr>
+        <w:t xml:space="preserve"> connectivity</w:t>
+      </w:r>
+      <w:r>
+        <w:rPr>
+          <w:rFonts w:ascii="Cambria" w:hAnsi="Cambria"/>
+          <w:sz w:val="21"/>
+          <w:szCs w:val="21"/>
+        </w:rPr>
+        <w:t xml:space="preserve">, </w:t>
+      </w:r>
+      <w:r>
+        <w:rPr>
+          <w:rFonts w:ascii="Cambria" w:hAnsi="Cambria"/>
+          <w:sz w:val="21"/>
+          <w:szCs w:val="21"/>
+        </w:rPr>
+        <w:t xml:space="preserve">document </w:t>
+      </w:r>
+      <w:r>
+        <w:rPr>
+          <w:rFonts w:ascii="Cambria" w:hAnsi="Cambria"/>
+          <w:sz w:val="21"/>
+          <w:szCs w:val="21"/>
+        </w:rPr>
+        <w:t xml:space="preserve">the </w:t>
+      </w:r>
+      <w:r>
+        <w:rPr>
+          <w:rFonts w:ascii="Cambria" w:hAnsi="Cambria"/>
+          <w:sz w:val="21"/>
+          <w:szCs w:val="21"/>
+        </w:rPr>
+        <w:t>migration procedures</w:t>
+      </w:r>
+      <w:r>
+        <w:rPr>
+          <w:rFonts w:ascii="Cambria" w:hAnsi="Cambria"/>
+          <w:sz w:val="21"/>
+          <w:szCs w:val="21"/>
+        </w:rPr>
+        <w:t xml:space="preserve"> and runbook</w:t>
+      </w:r>
+      <w:r>
+        <w:rPr>
+          <w:rFonts w:ascii="Cambria" w:hAnsi="Cambria"/>
+          <w:sz w:val="21"/>
+          <w:szCs w:val="21"/>
+        </w:rPr>
+        <w:t>s</w:t>
+      </w:r>
+      <w:r>
+        <w:rPr>
+          <w:rFonts w:ascii="Cambria" w:hAnsi="Cambria"/>
+          <w:sz w:val="21"/>
+          <w:szCs w:val="21"/>
+        </w:rPr>
+        <w:t xml:space="preserve"> </w:t>
+      </w:r>
+      <w:r>
+        <w:rPr>
+          <w:rFonts w:ascii="Cambria" w:hAnsi="Cambria"/>
+          <w:sz w:val="21"/>
+          <w:szCs w:val="21"/>
+        </w:rPr>
+        <w:t>in Confluence for operational support and knowledge sharing.</w:t>
+      </w:r>
+    </w:p>
+    <w:p>
+      <w:pPr>
+        <w:pStyle w:val="ListParagraph"/>
         <w:spacing w:after="0"/>
         <w:ind w:left="609"/>
         <w:jc w:val="both"/>
@@ -1440,34 +2626,10 @@
           <w:rFonts w:ascii="Cambria" w:hAnsi="Cambria"/>
         </w:rPr>
       </w:pPr>
-      <w:r>
-        <w:rPr>
-          <w:rFonts w:ascii="Cambria" w:hAnsi="Cambria"/>
-        </w:rPr>
-        <w:t xml:space="preserve">Configured database monitoring and performance metrics using </w:t>
-      </w:r>
-      <w:proofErr w:type="spellStart"/>
-      <w:r>
-        <w:rPr>
-          <w:rFonts w:ascii="Cambria" w:hAnsi="Cambria"/>
-        </w:rPr>
-        <w:t>cloudwatch</w:t>
-      </w:r>
-      <w:proofErr w:type="spellEnd"/>
-      <w:r>
-        <w:rPr>
-          <w:rFonts w:ascii="Cambria" w:hAnsi="Cambria"/>
-        </w:rPr>
-        <w:t xml:space="preserve"> and Oracle OEM</w:t>
-      </w:r>
-    </w:p>
-    <w:p>
-      <w:pPr>
-        <w:pStyle w:val="ListParagraph"/>
-        <w:numPr>
-          <w:ilvl w:val="0"/>
-          <w:numId w:val="4"/>
-        </w:numPr>
+    </w:p>
+    <w:p>
+      <w:pPr>
+        <w:pStyle w:val="ListParagraph"/>
         <w:spacing w:after="0"/>
         <w:ind w:left="609"/>
         <w:jc w:val="both"/>
@@ -1475,83 +2637,6 @@
           <w:rFonts w:ascii="Cambria" w:hAnsi="Cambria"/>
         </w:rPr>
       </w:pPr>
-      <w:r>
-        <w:rPr>
-          <w:rFonts w:ascii="Cambria" w:hAnsi="Cambria"/>
-        </w:rPr>
-        <w:t>Implemented automated RDS backup strategies, including snapshot scheduling and retention policies for disaster recovery</w:t>
-      </w:r>
-    </w:p>
-    <w:p>
-      <w:pPr>
-        <w:pStyle w:val="ListParagraph"/>
-        <w:numPr>
-          <w:ilvl w:val="0"/>
-          <w:numId w:val="4"/>
-        </w:numPr>
-        <w:spacing w:after="0"/>
-        <w:ind w:left="609"/>
-        <w:jc w:val="both"/>
-        <w:rPr>
-          <w:rFonts w:ascii="Cambria" w:hAnsi="Cambria"/>
-        </w:rPr>
-      </w:pPr>
-      <w:r>
-        <w:rPr>
-          <w:rFonts w:ascii="Cambria" w:hAnsi="Cambria"/>
-        </w:rPr>
-        <w:t>Supported vulnerability remediation activities and performed SSH key rotations for on-premise servers to address vulnerability findings</w:t>
-      </w:r>
-    </w:p>
-    <w:p>
-      <w:pPr>
-        <w:pStyle w:val="ListParagraph"/>
-        <w:numPr>
-          <w:ilvl w:val="0"/>
-          <w:numId w:val="4"/>
-        </w:numPr>
-        <w:spacing w:after="0"/>
-        <w:ind w:left="609"/>
-        <w:jc w:val="both"/>
-        <w:rPr>
-          <w:rFonts w:ascii="Cambria" w:hAnsi="Cambria"/>
-        </w:rPr>
-      </w:pPr>
-      <w:r>
-        <w:rPr>
-          <w:rFonts w:ascii="Cambria" w:hAnsi="Cambria"/>
-        </w:rPr>
-        <w:t>Collaborated with application teams to update database endpoints and validate application connectivity after migrations</w:t>
-      </w:r>
-    </w:p>
-    <w:p>
-      <w:pPr>
-        <w:pStyle w:val="ListParagraph"/>
-        <w:numPr>
-          <w:ilvl w:val="0"/>
-          <w:numId w:val="4"/>
-        </w:numPr>
-        <w:spacing w:after="0"/>
-        <w:ind w:left="609"/>
-        <w:jc w:val="both"/>
-        <w:rPr>
-          <w:rFonts w:ascii="Cambria" w:hAnsi="Cambria"/>
-        </w:rPr>
-      </w:pPr>
-      <w:r>
-        <w:rPr>
-          <w:rFonts w:ascii="Cambria" w:hAnsi="Cambria"/>
-        </w:rPr>
-        <w:t>Documented migration procedures, architecture details and operational runbooks in confluence for knowledge sharing and operational support</w:t>
-      </w:r>
-    </w:p>
-    <w:p>
-      <w:pPr>
-        <w:rPr>
-          <w:rFonts w:ascii="Cambria" w:hAnsi="Cambria"/>
-          <w:b/>
-        </w:rPr>
-      </w:pPr>
     </w:p>
     <w:p>
       <w:pPr>
@@ -1584,7 +2669,7 @@
           <w:rFonts w:ascii="Cambria" w:hAnsi="Cambria"/>
         </w:rPr>
         <w:pict>
-          <v:rect id="_x0000_i1043" style="width:0;height:1.5pt" o:hralign="center" o:hrstd="t" o:hr="t" fillcolor="#a0a0a0" stroked="f"/>
+          <v:rect id="_x0000_i1029" style="width:0;height:1.5pt" o:hralign="center" o:hrstd="t" o:hr="t" fillcolor="#a0a0a0" stroked="f"/>
         </w:pict>
       </w:r>
     </w:p>
@@ -1616,21 +2701,6 @@
         </w:rPr>
         <w:t xml:space="preserve"> </w:t>
       </w:r>
-      <w:r>
-        <w:rPr>
-          <w:rFonts w:ascii="Cambria" w:hAnsi="Cambria"/>
-          <w:b/>
-          <w:bCs/>
-        </w:rPr>
-        <w:t xml:space="preserve">- </w:t>
-      </w:r>
-      <w:r>
-        <w:rPr>
-          <w:rFonts w:ascii="Cambria" w:hAnsi="Cambria"/>
-          <w:bCs/>
-        </w:rPr>
-        <w:t>(ID: 2096b15a7bea483f85da40db433adb93)</w:t>
-      </w:r>
     </w:p>
     <w:p>
       <w:pPr>
@@ -1658,26 +2728,7 @@
           <w:b/>
           <w:bCs/>
         </w:rPr>
-        <w:t xml:space="preserve"> - </w:t>
-      </w:r>
-      <w:r>
-        <w:rPr>
-          <w:rFonts w:ascii="Cambria" w:hAnsi="Cambria"/>
-        </w:rPr>
-        <w:t>(</w:t>
-      </w:r>
-      <w:r>
-        <w:rPr>
-          <w:rFonts w:ascii="Cambria" w:hAnsi="Cambria"/>
-          <w:bCs/>
-        </w:rPr>
-        <w:t>ID: A1599AEBA31254</w:t>
-      </w:r>
-      <w:r>
-        <w:rPr>
-          <w:rFonts w:ascii="Cambria" w:hAnsi="Cambria"/>
-        </w:rPr>
-        <w:t>)</w:t>
+        <w:t xml:space="preserve"> </w:t>
       </w:r>
     </w:p>
     <w:p>
@@ -1758,7 +2809,7 @@
           <w:rFonts w:ascii="Cambria" w:hAnsi="Cambria"/>
         </w:rPr>
         <w:pict>
-          <v:rect id="_x0000_i1051" style="width:0;height:1.5pt" o:hralign="center" o:hrstd="t" o:hr="t" fillcolor="#a0a0a0" stroked="f"/>
+          <v:rect id="_x0000_i1030" style="width:0;height:1.5pt" o:hralign="center" o:hrstd="t" o:hr="t" fillcolor="#a0a0a0" stroked="f"/>
         </w:pict>
       </w:r>
     </w:p>
@@ -2903,6 +3954,7 @@
   <w:style w:type="character" w:default="1" w:styleId="DefaultParagraphFont">
     <w:name w:val="Default Paragraph Font"/>
     <w:uiPriority w:val="1"/>
+    <w:semiHidden/>
     <w:unhideWhenUsed/>
   </w:style>
   <w:style w:type="table" w:default="1" w:styleId="TableNormal">
@@ -3263,7 +4315,7 @@
 </file>
 
 <file path=customXml/itemProps1.xml><?xml version="1.0" encoding="utf-8"?>
-<ds:datastoreItem xmlns:ds="http://schemas.openxmlformats.org/officeDocument/2006/customXml" ds:itemID="{15F1792F-D910-4979-AAF0-A97C67B88989}">
+<ds:datastoreItem xmlns:ds="http://schemas.openxmlformats.org/officeDocument/2006/customXml" ds:itemID="{59DEA885-F88C-4F91-B0C8-61772A7F188C}">
   <ds:schemaRefs>
     <ds:schemaRef ds:uri="http://schemas.openxmlformats.org/officeDocument/2006/bibliography"/>
   </ds:schemaRefs>

</xml_diff>